<commit_message>
Cierre: 149 comprobaciones, auditoría QA y defectos corregidos en memoria, guía, README y Word; .exe regenerado
Co-Authored-By: Claude Sonnet 5.5 <noreply@anthropic.com>
</commit_message>
<xml_diff>
--- a/docs/MEMORIA_TFG.docx
+++ b/docs/MEMORIA_TFG.docx
@@ -518,7 +518,7 @@
           <w:bCs/>
           <w:lang w:val="es-ES"/>
         </w:rPr>
-        <w:t xml:space="preserve">35 pruebas unitarias y 50</w:t>
+        <w:t xml:space="preserve">35 pruebas unitarias y 114</w:t>
       </w:r>
       <w:r>
         <w:rPr>
@@ -546,7 +546,7 @@
         <w:rPr>
           <w:lang w:val="es-ES"/>
         </w:rPr>
-        <w:t xml:space="preserve">(Chrome y Electron), todas superadas.</w:t>
+        <w:t xml:space="preserve">(Chrome y Electron; 149 en total), todas superadas.</w:t>
       </w:r>
     </w:p>
     <w:p>
@@ -807,19 +807,19 @@
           <w:bCs/>
           <w:lang w:val="es-ES"/>
         </w:rPr>
-        <w:t xml:space="preserve">35 unit tests and 50 automated checks in real browsers</w:t>
-      </w:r>
-      <w:r>
-        <w:rPr>
-          <w:lang w:val="es-ES"/>
-        </w:rPr>
-        <w:t xml:space="preserve"> </w:t>
-      </w:r>
-      <w:r>
-        <w:rPr>
-          <w:lang w:val="es-ES"/>
-        </w:rPr>
-        <w:t xml:space="preserve">(Chrome and Electron), all</w:t>
+        <w:t xml:space="preserve">35 unit tests and 114 automated checks in real browsers</w:t>
+      </w:r>
+      <w:r>
+        <w:rPr>
+          <w:lang w:val="es-ES"/>
+        </w:rPr>
+        <w:t xml:space="preserve"> </w:t>
+      </w:r>
+      <w:r>
+        <w:rPr>
+          <w:lang w:val="es-ES"/>
+        </w:rPr>
+        <w:t xml:space="preserve">(Chrome and Electron; 149 in total), all</w:t>
       </w:r>
       <w:r>
         <w:rPr>
@@ -5792,7 +5792,7 @@
         <w:rPr>
           <w:lang w:val="es-ES"/>
         </w:rPr>
-        <w:t xml:space="preserve">Las pruebas automatizadas del entregable (35 unitarias y 50 en navegador real) validan el modo principal,</w:t>
+        <w:t xml:space="preserve">Las pruebas automatizadas del entregable (35 unitarias y 114 en navegador real) validan el modo principal,</w:t>
       </w:r>
       <w:r>
         <w:rPr>
@@ -10403,10 +10403,10 @@
         <w:tblLook w:firstRow="1" w:lastRow="0" w:firstColumn="0" w:lastColumn="0" w:noHBand="0" w:noVBand="0" w:val="0020"/>
       </w:tblPr>
       <w:tblGrid>
-        <w:gridCol w:w="1980"/>
-        <w:gridCol w:w="1980"/>
-        <w:gridCol w:w="1113"/>
-        <w:gridCol w:w="2846"/>
+        <w:gridCol w:w="2009"/>
+        <w:gridCol w:w="1773"/>
+        <w:gridCol w:w="1300"/>
+        <w:gridCol w:w="2837"/>
       </w:tblGrid>
       <w:tr>
         <w:trPr>
@@ -10783,6 +10783,100 @@
                 <w:bCs/>
                 <w:lang w:val="es-ES"/>
               </w:rPr>
+              <w:t xml:space="preserve">Auditoría QA web</w:t>
+            </w:r>
+            <w:r>
+              <w:rPr>
+                <w:lang w:val="es-ES"/>
+              </w:rPr>
+              <w:t xml:space="preserve"> </w:t>
+            </w:r>
+            <w:r>
+              <w:rPr>
+                <w:lang w:val="es-ES"/>
+              </w:rPr>
+              <w:t xml:space="preserve">(Chrome)</w:t>
+            </w:r>
+          </w:p>
+        </w:tc>
+        <w:tc>
+          <w:tcPr/>
+          <w:p>
+            <w:pPr>
+              <w:pStyle w:val="Compact"/>
+            </w:pPr>
+            <w:r>
+              <w:rPr>
+                <w:lang w:val="es-ES"/>
+              </w:rPr>
+              <w:t xml:space="preserve">Playwright</w:t>
+            </w:r>
+          </w:p>
+        </w:tc>
+        <w:tc>
+          <w:tcPr/>
+          <w:p>
+            <w:pPr>
+              <w:pStyle w:val="Compact"/>
+            </w:pPr>
+            <w:r>
+              <w:rPr>
+                <w:b/>
+                <w:bCs/>
+                <w:lang w:val="es-ES"/>
+              </w:rPr>
+              <w:t xml:space="preserve">64</w:t>
+            </w:r>
+            <w:r>
+              <w:rPr>
+                <w:lang w:val="es-ES"/>
+              </w:rPr>
+              <w:t xml:space="preserve"> </w:t>
+            </w:r>
+            <w:r>
+              <w:rPr>
+                <w:lang w:val="es-ES"/>
+              </w:rPr>
+              <w:t xml:space="preserve">comprobaciones en 8 bloques</w:t>
+            </w:r>
+          </w:p>
+        </w:tc>
+        <w:tc>
+          <w:tcPr/>
+          <w:p>
+            <w:pPr>
+              <w:pStyle w:val="Compact"/>
+            </w:pPr>
+            <w:r>
+              <w:rPr>
+                <w:b/>
+                <w:bCs/>
+                <w:lang w:val="es-ES"/>
+              </w:rPr>
+              <w:t xml:space="preserve">64 superadas</w:t>
+            </w:r>
+            <w:r>
+              <w:rPr>
+                <w:lang w:val="es-ES"/>
+              </w:rPr>
+              <w:t xml:space="preserve">, 0 errores de consola</w:t>
+            </w:r>
+          </w:p>
+        </w:tc>
+      </w:tr>
+      <w:tr>
+        <w:tc>
+          <w:tcPr/>
+          <w:p>
+            <w:pPr>
+              <w:pStyle w:val="Compact"/>
+            </w:pPr>
+            <w:r>
+              <w:rPr>
+                <w:b/>
+                <w:bCs/>
+                <w:lang w:val="es-ES"/>
+              </w:rPr>
               <w:t xml:space="preserve">E2E PWA</w:t>
             </w:r>
             <w:r>
@@ -11327,12 +11421,12 @@
       <w:pPr>
         <w:pStyle w:val="Heading2"/>
       </w:pPr>
-      <w:bookmarkStart w:id="64" w:name="_9e3f15859884d1348355e6002c7a860d9b316df"/>
-      <w:r>
-        <w:rPr>
-          <w:lang w:val="es-ES"/>
-        </w:rPr>
-        <w:t xml:space="preserve">10.2 Pruebas en navegador real (50)</w:t>
+      <w:bookmarkStart w:id="64" w:name="_e79bea4939f96994b16ecf1824b2c5924460a10"/>
+      <w:r>
+        <w:rPr>
+          <w:lang w:val="es-ES"/>
+        </w:rPr>
+        <w:t xml:space="preserve">10.2 Pruebas en navegador real (114)</w:t>
       </w:r>
       <w:bookmarkEnd w:id="64"/>
     </w:p>
@@ -11467,7 +11561,7 @@
           <w:bCs/>
           <w:lang w:val="es-ES"/>
         </w:rPr>
-        <w:t xml:space="preserve">PWA, 11 pasos</w:t>
+        <w:t xml:space="preserve">Auditoría QA web, 64 comprobaciones</w:t>
       </w:r>
       <w:r>
         <w:rPr>
@@ -11486,79 +11580,13 @@
           <w:rStyle w:val="VerbatimChar"/>
           <w:lang w:val="es-ES"/>
         </w:rPr>
-        <w:t xml:space="preserve">e2e/pwa.mjs</w:t>
-      </w:r>
-      <w:r>
-        <w:rPr>
-          <w:lang w:val="es-ES"/>
-        </w:rPr>
-        <w:t xml:space="preserve">): manifest e iconos válidos;</w:t>
-      </w:r>
-      <w:r>
-        <w:rPr>
-          <w:lang w:val="es-ES"/>
-        </w:rPr>
-        <w:t xml:space="preserve"> </w:t>
-      </w:r>
-      <w:r>
-        <w:rPr>
-          <w:b/>
-          <w:bCs/>
-          <w:lang w:val="es-ES"/>
-        </w:rPr>
-        <w:t xml:space="preserve">Chrome no detecta errores de instalabilidad</w:t>
-      </w:r>
-      <w:r>
-        <w:rPr>
-          <w:lang w:val="es-ES"/>
-        </w:rPr>
-        <w:t xml:space="preserve">; el Service Worker toma el control; el</w:t>
-      </w:r>
-      <w:r>
-        <w:rPr>
-          <w:lang w:val="es-ES"/>
-        </w:rPr>
-        <w:t xml:space="preserve"> </w:t>
-      </w:r>
-      <w:r>
-        <w:rPr>
-          <w:i/>
-          <w:iCs/>
-          <w:lang w:val="es-ES"/>
-        </w:rPr>
-        <w:t xml:space="preserve">app shell</w:t>
-      </w:r>
-      <w:r>
-        <w:rPr>
-          <w:lang w:val="es-ES"/>
-        </w:rPr>
-        <w:t xml:space="preserve"> </w:t>
-      </w:r>
-      <w:r>
-        <w:rPr>
-          <w:lang w:val="es-ES"/>
-        </w:rPr>
-        <w:t xml:space="preserve">queda en caché;</w:t>
-      </w:r>
-      <w:r>
-        <w:rPr>
-          <w:lang w:val="es-ES"/>
-        </w:rPr>
-        <w:t xml:space="preserve"> </w:t>
-      </w:r>
-      <w:r>
-        <w:rPr>
-          <w:b/>
-          <w:bCs/>
-          <w:lang w:val="es-ES"/>
-        </w:rPr>
-        <w:t xml:space="preserve">sin conexión</w:t>
-      </w:r>
-      <w:r>
-        <w:rPr>
-          <w:lang w:val="es-ES"/>
-        </w:rPr>
-        <w:t xml:space="preserve">: arranque, uso de la app, recarga en una ruta profunda y asistente en modo de respaldo;</w:t>
+        <w:t xml:space="preserve">e2e/auditoria.mjs</w:t>
+      </w:r>
+      <w:r>
+        <w:rPr>
+          <w:lang w:val="es-ES"/>
+        </w:rPr>
+        <w:t xml:space="preserve">), organizadas en los 8 bloques de la aplicación: (1) acceso, registro, recuperación de contraseña, rutas protegidas y bloqueo por fuerza bruta con desbloqueo a los 60 s; (2) barra lateral, cajón móvil y buscador; (3) panel; (4) páginas dinámicas: banner, avatar, título, cita, reglas, tracker con hasta 8 hábitos, notas y filtros, sin scroll horizontal a 1280, 390 y 320 px; (5) calendario; (6) límite Free, plan Pro simulado, vuelta a Free y ajustes de cuenta; (7) asistente, con y sin red, y resistencia a inyección de instrucciones y a</w:t>
       </w:r>
       <w:r>
         <w:rPr>
@@ -11571,321 +11599,25 @@
           <w:rStyle w:val="VerbatimChar"/>
           <w:lang w:val="es-ES"/>
         </w:rPr>
-        <w:t xml:space="preserve">/api/</w:t>
-      </w:r>
-      <w:r>
-        <w:rPr>
-          <w:lang w:val="es-ES"/>
-        </w:rPr>
-        <w:t xml:space="preserve"> </w:t>
-      </w:r>
-      <w:r>
-        <w:rPr>
-          <w:lang w:val="es-ES"/>
-        </w:rPr>
-        <w:t xml:space="preserve">nunca en caché; sin desbordamiento en móvil.</w:t>
-      </w:r>
-    </w:p>
-    <w:p>
-      <w:pPr>
-        <w:pStyle w:val="BodyText"/>
-      </w:pPr>
-      <w:r>
-        <w:rPr>
-          <w:b/>
-          <w:bCs/>
-          <w:lang w:val="es-ES"/>
-        </w:rPr>
-        <w:t xml:space="preserve">Electron, 16 pasos</w:t>
-      </w:r>
-      <w:r>
-        <w:rPr>
-          <w:lang w:val="es-ES"/>
-        </w:rPr>
-        <w:t xml:space="preserve"> </w:t>
-      </w:r>
-      <w:r>
-        <w:rPr>
-          <w:lang w:val="es-ES"/>
-        </w:rPr>
-        <w:t xml:space="preserve">(</w:t>
-      </w:r>
-      <w:r>
-        <w:rPr>
-          <w:rStyle w:val="VerbatimChar"/>
-          <w:lang w:val="es-ES"/>
-        </w:rPr>
-        <w:t xml:space="preserve">e2e/electron.mjs</w:t>
-      </w:r>
-      <w:r>
-        <w:rPr>
-          <w:lang w:val="es-ES"/>
-        </w:rPr>
-        <w:t xml:space="preserve">; se ejecutan tanto con</w:t>
-      </w:r>
-      <w:r>
-        <w:rPr>
-          <w:lang w:val="es-ES"/>
-        </w:rPr>
-        <w:t xml:space="preserve"> </w:t>
-      </w:r>
-      <w:r>
-        <w:rPr>
-          <w:rStyle w:val="VerbatimChar"/>
-          <w:lang w:val="es-ES"/>
-        </w:rPr>
-        <w:t xml:space="preserve">electron .</w:t>
-      </w:r>
-      <w:r>
-        <w:rPr>
-          <w:lang w:val="es-ES"/>
-        </w:rPr>
-        <w:t xml:space="preserve"> </w:t>
-      </w:r>
-      <w:r>
-        <w:rPr>
-          <w:lang w:val="es-ES"/>
-        </w:rPr>
-        <w:t xml:space="preserve">como contra el</w:t>
-      </w:r>
-      <w:r>
-        <w:rPr>
-          <w:lang w:val="es-ES"/>
-        </w:rPr>
-        <w:t xml:space="preserve"> </w:t>
-      </w:r>
-      <w:r>
-        <w:rPr>
-          <w:rStyle w:val="VerbatimChar"/>
-          <w:lang w:val="es-ES"/>
-        </w:rPr>
-        <w:t xml:space="preserve">.exe</w:t>
-      </w:r>
-      <w:r>
-        <w:rPr>
-          <w:lang w:val="es-ES"/>
-        </w:rPr>
-        <w:t xml:space="preserve"> </w:t>
-      </w:r>
-      <w:r>
-        <w:rPr>
-          <w:lang w:val="es-ES"/>
-        </w:rPr>
-        <w:t xml:space="preserve">empaquetado): carga por</w:t>
-      </w:r>
-      <w:r>
-        <w:rPr>
-          <w:lang w:val="es-ES"/>
-        </w:rPr>
-        <w:t xml:space="preserve"> </w:t>
-      </w:r>
-      <w:r>
-        <w:rPr>
-          <w:rStyle w:val="VerbatimChar"/>
-          <w:lang w:val="es-ES"/>
-        </w:rPr>
-        <w:t xml:space="preserve">app://</w:t>
-      </w:r>
-      <w:r>
-        <w:rPr>
-          <w:lang w:val="es-ES"/>
-        </w:rPr>
-        <w:t xml:space="preserve">;</w:t>
-      </w:r>
-      <w:r>
-        <w:rPr>
-          <w:lang w:val="es-ES"/>
-        </w:rPr>
-        <w:t xml:space="preserve"> </w:t>
-      </w:r>
-      <w:r>
-        <w:rPr>
-          <w:b/>
-          <w:bCs/>
-          <w:lang w:val="es-ES"/>
-        </w:rPr>
-        <w:t xml:space="preserve">sin</w:t>
-      </w:r>
-      <w:r>
-        <w:rPr>
-          <w:b/>
-          <w:bCs/>
-          <w:lang w:val="es-ES"/>
-        </w:rPr>
-        <w:t xml:space="preserve"> </w:t>
-      </w:r>
-      <w:r>
-        <w:rPr>
-          <w:rStyle w:val="VerbatimChar"/>
-          <w:b/>
-          <w:bCs/>
-          <w:lang w:val="es-ES"/>
-        </w:rPr>
-        <w:t xml:space="preserve">require</w:t>
-      </w:r>
-      <w:r>
-        <w:rPr>
-          <w:b/>
-          <w:bCs/>
-          <w:lang w:val="es-ES"/>
-        </w:rPr>
-        <w:t xml:space="preserve">,</w:t>
-      </w:r>
-      <w:r>
-        <w:rPr>
-          <w:b/>
-          <w:bCs/>
-          <w:lang w:val="es-ES"/>
-        </w:rPr>
-        <w:t xml:space="preserve"> </w:t>
-      </w:r>
-      <w:r>
-        <w:rPr>
-          <w:rStyle w:val="VerbatimChar"/>
-          <w:b/>
-          <w:bCs/>
-          <w:lang w:val="es-ES"/>
-        </w:rPr>
-        <w:t xml:space="preserve">process</w:t>
-      </w:r>
-      <w:r>
-        <w:rPr>
-          <w:b/>
-          <w:bCs/>
-          <w:lang w:val="es-ES"/>
-        </w:rPr>
-        <w:t xml:space="preserve"> </w:t>
-      </w:r>
-      <w:r>
-        <w:rPr>
-          <w:b/>
-          <w:bCs/>
-          <w:lang w:val="es-ES"/>
-        </w:rPr>
-        <w:t xml:space="preserve">ni</w:t>
-      </w:r>
-      <w:r>
-        <w:rPr>
-          <w:b/>
-          <w:bCs/>
-          <w:lang w:val="es-ES"/>
-        </w:rPr>
-        <w:t xml:space="preserve"> </w:t>
-      </w:r>
-      <w:r>
-        <w:rPr>
-          <w:rStyle w:val="VerbatimChar"/>
-          <w:b/>
-          <w:bCs/>
-          <w:lang w:val="es-ES"/>
-        </w:rPr>
-        <w:t xml:space="preserve">Buffer</w:t>
-      </w:r>
-      <w:r>
-        <w:rPr>
-          <w:lang w:val="es-ES"/>
-        </w:rPr>
-        <w:t xml:space="preserve"> </w:t>
-      </w:r>
-      <w:r>
-        <w:rPr>
-          <w:lang w:val="es-ES"/>
-        </w:rPr>
-        <w:t xml:space="preserve">en la página;</w:t>
-      </w:r>
-      <w:r>
-        <w:rPr>
-          <w:lang w:val="es-ES"/>
-        </w:rPr>
-        <w:t xml:space="preserve"> </w:t>
-      </w:r>
-      <w:r>
-        <w:rPr>
-          <w:rStyle w:val="VerbatimChar"/>
-          <w:lang w:val="es-ES"/>
-        </w:rPr>
-        <w:t xml:space="preserve">contextBridge</w:t>
-      </w:r>
-      <w:r>
-        <w:rPr>
-          <w:lang w:val="es-ES"/>
-        </w:rPr>
-        <w:t xml:space="preserve"> </w:t>
-      </w:r>
-      <w:r>
-        <w:rPr>
-          <w:lang w:val="es-ES"/>
-        </w:rPr>
-        <w:t xml:space="preserve">de solo lectura;</w:t>
-      </w:r>
-      <w:r>
-        <w:rPr>
-          <w:lang w:val="es-ES"/>
-        </w:rPr>
-        <w:t xml:space="preserve"> </w:t>
-      </w:r>
-      <w:r>
-        <w:rPr>
-          <w:b/>
-          <w:bCs/>
-          <w:lang w:val="es-ES"/>
-        </w:rPr>
-        <w:t xml:space="preserve">CSP bloquea scripts en línea y</w:t>
-      </w:r>
-      <w:r>
-        <w:rPr>
-          <w:b/>
-          <w:bCs/>
-          <w:lang w:val="es-ES"/>
-        </w:rPr>
-        <w:t xml:space="preserve"> </w:t>
-      </w:r>
-      <w:r>
-        <w:rPr>
-          <w:rStyle w:val="VerbatimChar"/>
-          <w:b/>
-          <w:bCs/>
-          <w:lang w:val="es-ES"/>
-        </w:rPr>
-        <w:t xml:space="preserve">eval</w:t>
-      </w:r>
-      <w:r>
-        <w:rPr>
-          <w:lang w:val="es-ES"/>
-        </w:rPr>
-        <w:t xml:space="preserve">; sin</w:t>
-      </w:r>
-      <w:r>
-        <w:rPr>
-          <w:lang w:val="es-ES"/>
-        </w:rPr>
-        <w:t xml:space="preserve"> </w:t>
-      </w:r>
-      <w:r>
-        <w:rPr>
-          <w:i/>
-          <w:iCs/>
-          <w:lang w:val="es-ES"/>
-        </w:rPr>
-        <w:t xml:space="preserve">path traversal</w:t>
-      </w:r>
-      <w:r>
-        <w:rPr>
-          <w:lang w:val="es-ES"/>
-        </w:rPr>
-        <w:t xml:space="preserve">; proxy restringido a una ruta; uso completo de la aplicación; recarga en ruta profunda; ventana nueva y navegación externa bloqueadas.</w:t>
-      </w:r>
-    </w:p>
-    <w:p>
-      <w:pPr>
-        <w:pStyle w:val="Heading2"/>
-      </w:pPr>
-      <w:bookmarkStart w:id="65" w:name="_49a66ba4d60b94f9795291e563ee7b27cbe98a0"/>
-      <w:r>
-        <w:rPr>
-          <w:lang w:val="es-ES"/>
-        </w:rPr>
-        <w:t xml:space="preserve">10.3 Qué no cubren las pruebas</w:t>
+        <w:t xml:space="preserve">&lt;script&gt;</w:t>
+      </w:r>
+      <w:r>
+        <w:rPr>
+          <w:lang w:val="es-ES"/>
+        </w:rPr>
+        <w:t xml:space="preserve">; (8) clics repetidos y consola sin errores. Se ejecutó repetidas veces hasta que todas pasaron. El asistente se auditó en su modo de respaldo (sin el proxy PHP en marcha); la respuesta real de Gemini se verifica aparte, a mano, para no gastar la cuota gratuita.</w:t>
+      </w:r>
+    </w:p>
+    <w:p>
+      <w:pPr>
+        <w:pStyle w:val="Heading3"/>
+      </w:pPr>
+      <w:bookmarkStart w:id="65" w:name="_8e3296ef648aef0ae8fdec01e6b461a9ff0da64"/>
+      <w:r>
+        <w:rPr>
+          <w:lang w:val="es-ES"/>
+        </w:rPr>
+        <w:t xml:space="preserve">Defectos hallados por la auditoría y corregidos</w:t>
       </w:r>
       <w:bookmarkEnd w:id="65"/>
     </w:p>
@@ -11897,644 +11629,8 @@
         <w:rPr>
           <w:lang w:val="es-ES"/>
         </w:rPr>
-        <w:t xml:space="preserve">Las pruebas validan el modo principal Local-First en la web, la PWA y Electron. Quedan fuera del alcance verificado, por pertenecer a la</w:t>
-      </w:r>
-      <w:r>
-        <w:rPr>
-          <w:lang w:val="es-ES"/>
-        </w:rPr>
-        <w:t xml:space="preserve"> </w:t>
-      </w:r>
-      <w:r>
-        <w:rPr>
-          <w:lang w:val="es-ES"/>
-        </w:rPr>
-        <w:t xml:space="preserve">fase de despliegue cloud: los adaptadores de Firebase (autenticación, reglas contra el emulador oficial e inicio de sesión con Google),</w:t>
-      </w:r>
-      <w:r>
-        <w:rPr>
-          <w:lang w:val="es-ES"/>
-        </w:rPr>
-        <w:t xml:space="preserve"> </w:t>
-      </w:r>
-      <w:r>
-        <w:rPr>
-          <w:lang w:val="es-ES"/>
-        </w:rPr>
-        <w:t xml:space="preserve">la compilación del APK/IPA y la calidad de las respuestas de la IA, que no es determinista. Se recogen como línea futura (sección 12.3).</w:t>
-      </w:r>
-    </w:p>
-    <w:p>
-      <w:r>
-        <w:pict>
-          <v:rect style="width:0;height:1.5pt" o:hralign="center" o:hrstd="t" o:hr="t"/>
-        </w:pict>
-      </w:r>
-    </w:p>
-    <w:p>
-      <w:pPr>
-        <w:pStyle w:val="Heading1"/>
-      </w:pPr>
-      <w:bookmarkStart w:id="66" w:name="_37019a45c8b34b51a647273f001b1ab578066b2"/>
-      <w:r>
-        <w:rPr>
-          <w:lang w:val="es-ES"/>
-        </w:rPr>
-        <w:t xml:space="preserve">11. Problemas encontrados y decisiones</w:t>
-      </w:r>
-      <w:bookmarkEnd w:id="66"/>
-    </w:p>
-    <w:p>
-      <w:pPr>
-        <w:pStyle w:val="FirstParagraph"/>
-      </w:pPr>
-      <w:r>
-        <w:rPr>
-          <w:lang w:val="es-ES"/>
-        </w:rPr>
-        <w:t xml:space="preserve">Esta sección recoge incidencias reales del proceso, porque las decisiones técnicas razonadas son parte del valor del trabajo.</w:t>
-      </w:r>
-    </w:p>
-    <w:p>
-      <w:pPr>
-        <w:pStyle w:val="Compact"/>
-        <w:numPr>
-          <w:ilvl w:val="0"/>
-          <w:numId w:val="1008"/>
-        </w:numPr>
-      </w:pPr>
-      <w:r>
-        <w:rPr>
-          <w:b/>
-          <w:bCs/>
-          <w:lang w:val="es-ES"/>
-        </w:rPr>
-        <w:t xml:space="preserve">Alcance.</w:t>
-      </w:r>
-      <w:r>
-        <w:rPr>
-          <w:lang w:val="es-ES"/>
-        </w:rPr>
-        <w:t xml:space="preserve"> </w:t>
-      </w:r>
-      <w:r>
-        <w:rPr>
-          <w:lang w:val="es-ES"/>
-        </w:rPr>
-        <w:t xml:space="preserve">La idea inicial (asistente de IA general) se sustituyó por un rastreador de hábitos concreto y completable, conservando una versión de respaldo en PHP/MySQL.</w:t>
-      </w:r>
-    </w:p>
-    <w:p>
-      <w:pPr>
-        <w:pStyle w:val="Compact"/>
-        <w:numPr>
-          <w:ilvl w:val="0"/>
-          <w:numId w:val="1008"/>
-        </w:numPr>
-      </w:pPr>
-      <w:r>
-        <w:rPr>
-          <w:b/>
-          <w:bCs/>
-          <w:lang w:val="es-ES"/>
-        </w:rPr>
-        <w:t xml:space="preserve">Persistencia dual y enfoque Local-First.</w:t>
-      </w:r>
-      <w:r>
-        <w:rPr>
-          <w:lang w:val="es-ES"/>
-        </w:rPr>
-        <w:t xml:space="preserve"> </w:t>
-      </w:r>
-      <w:r>
-        <w:rPr>
-          <w:lang w:val="es-ES"/>
-        </w:rPr>
-        <w:t xml:space="preserve">Se diseñó la interfaz</w:t>
-      </w:r>
-      <w:r>
-        <w:rPr>
-          <w:lang w:val="es-ES"/>
-        </w:rPr>
-        <w:t xml:space="preserve"> </w:t>
-      </w:r>
-      <w:r>
-        <w:rPr>
-          <w:rStyle w:val="VerbatimChar"/>
-          <w:lang w:val="es-ES"/>
-        </w:rPr>
-        <w:t xml:space="preserve">Backend</w:t>
-      </w:r>
-      <w:r>
-        <w:rPr>
-          <w:lang w:val="es-ES"/>
-        </w:rPr>
-        <w:t xml:space="preserve"> </w:t>
-      </w:r>
-      <w:r>
-        <w:rPr>
-          <w:lang w:val="es-ES"/>
-        </w:rPr>
-        <w:t xml:space="preserve">con una implementación local completa que reproduce autenticación, sesiones y aislamiento, y con los adaptadores de Firebase como alternativa intercambiable. Fue la decisión de mayor retorno del proyecto: da privacidad, coste cero y uso sin conexión, y permitió ejecutar pruebas automáticas sin depender de ningún servicio externo.</w:t>
-      </w:r>
-    </w:p>
-    <w:p>
-      <w:pPr>
-        <w:pStyle w:val="Compact"/>
-        <w:numPr>
-          <w:ilvl w:val="0"/>
-          <w:numId w:val="1008"/>
-        </w:numPr>
-      </w:pPr>
-      <w:r>
-        <w:rPr>
-          <w:b/>
-          <w:bCs/>
-          <w:lang w:val="es-ES"/>
-        </w:rPr>
-        <w:t xml:space="preserve">Errores que solo aparecieron al ejecutar en un navegador real.</w:t>
-      </w:r>
-      <w:r>
-        <w:rPr>
-          <w:lang w:val="es-ES"/>
-        </w:rPr>
-        <w:t xml:space="preserve"> </w:t>
-      </w:r>
-      <w:r>
-        <w:rPr>
-          <w:lang w:val="es-ES"/>
-        </w:rPr>
-        <w:t xml:space="preserve">Recargar en</w:t>
-      </w:r>
-      <w:r>
-        <w:rPr>
-          <w:lang w:val="es-ES"/>
-        </w:rPr>
-        <w:t xml:space="preserve"> </w:t>
-      </w:r>
-      <w:r>
-        <w:rPr>
-          <w:rStyle w:val="VerbatimChar"/>
-          <w:lang w:val="es-ES"/>
-        </w:rPr>
-        <w:t xml:space="preserve">/p/…</w:t>
-      </w:r>
-      <w:r>
-        <w:rPr>
-          <w:lang w:val="es-ES"/>
-        </w:rPr>
-        <w:t xml:space="preserve"> </w:t>
-      </w:r>
-      <w:r>
-        <w:rPr>
-          <w:lang w:val="es-ES"/>
-        </w:rPr>
-        <w:t xml:space="preserve">redirigía al panel porque, durante un instante, había usuario pero los datos aún figuraban como «no cargando»: la página parecía no existir. Se corrigió derivando el estado de «cargando» del usuario para el que han llegado datos. El avatar quedaba medio tapado por el banner (falta de</w:t>
-      </w:r>
-      <w:r>
-        <w:rPr>
-          <w:lang w:val="es-ES"/>
-        </w:rPr>
-        <w:t xml:space="preserve"> </w:t>
-      </w:r>
-      <w:r>
-        <w:rPr>
-          <w:rStyle w:val="VerbatimChar"/>
-          <w:lang w:val="es-ES"/>
-        </w:rPr>
-        <w:t xml:space="preserve">z-index</w:t>
-      </w:r>
-      <w:r>
-        <w:rPr>
-          <w:lang w:val="es-ES"/>
-        </w:rPr>
-        <w:t xml:space="preserve">). Ambos pasaron las pruebas unitarias y solo los detectó la prueba de navegador.</w:t>
-      </w:r>
-    </w:p>
-    <w:p>
-      <w:pPr>
-        <w:pStyle w:val="Compact"/>
-        <w:numPr>
-          <w:ilvl w:val="0"/>
-          <w:numId w:val="1008"/>
-        </w:numPr>
-      </w:pPr>
-      <w:r>
-        <w:rPr>
-          <w:b/>
-          <w:bCs/>
-          <w:lang w:val="es-ES"/>
-        </w:rPr>
-        <w:t xml:space="preserve">Modelo de IA retirado.</w:t>
-      </w:r>
-      <w:r>
-        <w:rPr>
-          <w:lang w:val="es-ES"/>
-        </w:rPr>
-        <w:t xml:space="preserve"> </w:t>
-      </w:r>
-      <w:r>
-        <w:rPr>
-          <w:rStyle w:val="VerbatimChar"/>
-          <w:lang w:val="es-ES"/>
-        </w:rPr>
-        <w:t xml:space="preserve">gemini-2.5-flash</w:t>
-      </w:r>
-      <w:r>
-        <w:rPr>
-          <w:lang w:val="es-ES"/>
-        </w:rPr>
-        <w:t xml:space="preserve"> </w:t>
-      </w:r>
-      <w:r>
-        <w:rPr>
-          <w:lang w:val="es-ES"/>
-        </w:rPr>
-        <w:t xml:space="preserve">(el modelo pedido inicialmente) ya no admite cuentas nuevas (error 404). Se consultó la lista de modelos disponibles, se descubrió que</w:t>
-      </w:r>
-      <w:r>
-        <w:rPr>
-          <w:lang w:val="es-ES"/>
-        </w:rPr>
-        <w:t xml:space="preserve"> </w:t>
-      </w:r>
-      <w:r>
-        <w:rPr>
-          <w:rStyle w:val="VerbatimChar"/>
-          <w:lang w:val="es-ES"/>
-        </w:rPr>
-        <w:t xml:space="preserve">gemini-3.8-flash</w:t>
-      </w:r>
-      <w:r>
-        <w:rPr>
-          <w:lang w:val="es-ES"/>
-        </w:rPr>
-        <w:t xml:space="preserve"> </w:t>
-      </w:r>
-      <w:r>
-        <w:rPr>
-          <w:lang w:val="es-ES"/>
-        </w:rPr>
-        <w:t xml:space="preserve">no respondía (tiempo de espera) y se fijó</w:t>
-      </w:r>
-      <w:r>
-        <w:rPr>
-          <w:lang w:val="es-ES"/>
-        </w:rPr>
-        <w:t xml:space="preserve"> </w:t>
-      </w:r>
-      <w:r>
-        <w:rPr>
-          <w:rStyle w:val="VerbatimChar"/>
-          <w:lang w:val="es-ES"/>
-        </w:rPr>
-        <w:t xml:space="preserve">gemini-3.5-flash</w:t>
-      </w:r>
-      <w:r>
-        <w:rPr>
-          <w:lang w:val="es-ES"/>
-        </w:rPr>
-        <w:t xml:space="preserve"> </w:t>
-      </w:r>
-      <w:r>
-        <w:rPr>
-          <w:lang w:val="es-ES"/>
-        </w:rPr>
-        <w:t xml:space="preserve">(2 s), configurable. Además, Gemini devuelve errores 503/429 puntuales: se añadió reintento y, cuando la cuota se agotó durante las pruebas, el modo de respaldo funcionó como estaba diseñado.</w:t>
-      </w:r>
-    </w:p>
-    <w:p>
-      <w:pPr>
-        <w:pStyle w:val="Compact"/>
-        <w:numPr>
-          <w:ilvl w:val="0"/>
-          <w:numId w:val="1008"/>
-        </w:numPr>
-      </w:pPr>
-      <w:r>
-        <w:rPr>
-          <w:b/>
-          <w:bCs/>
-          <w:lang w:val="es-ES"/>
-        </w:rPr>
-        <w:t xml:space="preserve">Electron arrancaba como Node.</w:t>
-      </w:r>
-      <w:r>
-        <w:rPr>
-          <w:lang w:val="es-ES"/>
-        </w:rPr>
-        <w:t xml:space="preserve"> </w:t>
-      </w:r>
-      <w:r>
-        <w:rPr>
-          <w:lang w:val="es-ES"/>
-        </w:rPr>
-        <w:t xml:space="preserve">Un editor define</w:t>
-      </w:r>
-      <w:r>
-        <w:rPr>
-          <w:lang w:val="es-ES"/>
-        </w:rPr>
-        <w:t xml:space="preserve"> </w:t>
-      </w:r>
-      <w:r>
-        <w:rPr>
-          <w:rStyle w:val="VerbatimChar"/>
-          <w:lang w:val="es-ES"/>
-        </w:rPr>
-        <w:t xml:space="preserve">ELECTRON_RUN_AS_NODE=1</w:t>
-      </w:r>
-      <w:r>
-        <w:rPr>
-          <w:lang w:val="es-ES"/>
-        </w:rPr>
-        <w:t xml:space="preserve"> </w:t>
-      </w:r>
-      <w:r>
-        <w:rPr>
-          <w:lang w:val="es-ES"/>
-        </w:rPr>
-        <w:t xml:space="preserve">en sus terminales y Electron se comporta como Node (error «</w:t>
-      </w:r>
-      <w:r>
-        <w:rPr>
-          <w:rStyle w:val="VerbatimChar"/>
-          <w:lang w:val="es-ES"/>
-        </w:rPr>
-        <w:t xml:space="preserve">protocol</w:t>
-      </w:r>
-      <w:r>
-        <w:rPr>
-          <w:lang w:val="es-ES"/>
-        </w:rPr>
-        <w:t xml:space="preserve"> </w:t>
-      </w:r>
-      <w:r>
-        <w:rPr>
-          <w:lang w:val="es-ES"/>
-        </w:rPr>
-        <w:t xml:space="preserve">is undefined»). Se resolvió con un lanzador (</w:t>
-      </w:r>
-      <w:r>
-        <w:rPr>
-          <w:rStyle w:val="VerbatimChar"/>
-          <w:lang w:val="es-ES"/>
-        </w:rPr>
-        <w:t xml:space="preserve">scripts/lanzar-electron.mjs</w:t>
-      </w:r>
-      <w:r>
-        <w:rPr>
-          <w:lang w:val="es-ES"/>
-        </w:rPr>
-        <w:t xml:space="preserve">) que limpia la variable.</w:t>
-      </w:r>
-    </w:p>
-    <w:p>
-      <w:pPr>
-        <w:pStyle w:val="Compact"/>
-        <w:numPr>
-          <w:ilvl w:val="0"/>
-          <w:numId w:val="1008"/>
-        </w:numPr>
-      </w:pPr>
-      <w:r>
-        <w:rPr>
-          <w:b/>
-          <w:bCs/>
-          <w:lang w:val="es-ES"/>
-        </w:rPr>
-        <w:t xml:space="preserve">CSP y scripts en línea.</w:t>
-      </w:r>
-      <w:r>
-        <w:rPr>
-          <w:lang w:val="es-ES"/>
-        </w:rPr>
-        <w:t xml:space="preserve"> </w:t>
-      </w:r>
-      <w:r>
-        <w:rPr>
-          <w:lang w:val="es-ES"/>
-        </w:rPr>
-        <w:t xml:space="preserve">Para poder aplicar una política</w:t>
-      </w:r>
-      <w:r>
-        <w:rPr>
-          <w:lang w:val="es-ES"/>
-        </w:rPr>
-        <w:t xml:space="preserve"> </w:t>
-      </w:r>
-      <w:r>
-        <w:rPr>
-          <w:rStyle w:val="VerbatimChar"/>
-          <w:lang w:val="es-ES"/>
-        </w:rPr>
-        <w:t xml:space="preserve">script-src 'self'</w:t>
-      </w:r>
-      <w:r>
-        <w:rPr>
-          <w:lang w:val="es-ES"/>
-        </w:rPr>
-        <w:t xml:space="preserve"> </w:t>
-      </w:r>
-      <w:r>
-        <w:rPr>
-          <w:lang w:val="es-ES"/>
-        </w:rPr>
-        <w:t xml:space="preserve">se movió el script que aplica el tema a un archivo externo (</w:t>
-      </w:r>
-      <w:r>
-        <w:rPr>
-          <w:rStyle w:val="VerbatimChar"/>
-          <w:lang w:val="es-ES"/>
-        </w:rPr>
-        <w:t xml:space="preserve">theme-init.js</w:t>
-      </w:r>
-      <w:r>
-        <w:rPr>
-          <w:lang w:val="es-ES"/>
-        </w:rPr>
-        <w:t xml:space="preserve">).</w:t>
-      </w:r>
-    </w:p>
-    <w:p>
-      <w:pPr>
-        <w:pStyle w:val="Compact"/>
-        <w:numPr>
-          <w:ilvl w:val="0"/>
-          <w:numId w:val="1008"/>
-        </w:numPr>
-      </w:pPr>
-      <w:r>
-        <w:rPr>
-          <w:b/>
-          <w:bCs/>
-          <w:lang w:val="es-ES"/>
-        </w:rPr>
-        <w:t xml:space="preserve">Pruebas frágiles.</w:t>
-      </w:r>
-      <w:r>
-        <w:rPr>
-          <w:lang w:val="es-ES"/>
-        </w:rPr>
-        <w:t xml:space="preserve"> </w:t>
-      </w:r>
-      <w:r>
-        <w:rPr>
-          <w:lang w:val="es-ES"/>
-        </w:rPr>
-        <w:t xml:space="preserve">Varias fallaron por la herramienta y no por la aplicación (el protocolo</w:t>
-      </w:r>
-      <w:r>
-        <w:rPr>
-          <w:lang w:val="es-ES"/>
-        </w:rPr>
-        <w:t xml:space="preserve"> </w:t>
-      </w:r>
-      <w:r>
-        <w:rPr>
-          <w:rStyle w:val="VerbatimChar"/>
-          <w:lang w:val="es-ES"/>
-        </w:rPr>
-        <w:t xml:space="preserve">app://</w:t>
-      </w:r>
-      <w:r>
-        <w:rPr>
-          <w:lang w:val="es-ES"/>
-        </w:rPr>
-        <w:t xml:space="preserve"> </w:t>
-      </w:r>
-      <w:r>
-        <w:rPr>
-          <w:lang w:val="es-ES"/>
-        </w:rPr>
-        <w:t xml:space="preserve">no notifica «navegación terminada»;</w:t>
-      </w:r>
-      <w:r>
-        <w:rPr>
-          <w:lang w:val="es-ES"/>
-        </w:rPr>
-        <w:t xml:space="preserve"> </w:t>
-      </w:r>
-      <w:r>
-        <w:rPr>
-          <w:rStyle w:val="VerbatimChar"/>
-          <w:lang w:val="es-ES"/>
-        </w:rPr>
-        <w:t xml:space="preserve">page.evaluate</w:t>
-      </w:r>
-      <w:r>
-        <w:rPr>
-          <w:lang w:val="es-ES"/>
-        </w:rPr>
-        <w:t xml:space="preserve"> </w:t>
-      </w:r>
-      <w:r>
-        <w:rPr>
-          <w:lang w:val="es-ES"/>
-        </w:rPr>
-        <w:t xml:space="preserve">ejecuta</w:t>
-      </w:r>
-      <w:r>
-        <w:rPr>
-          <w:lang w:val="es-ES"/>
-        </w:rPr>
-        <w:t xml:space="preserve"> </w:t>
-      </w:r>
-      <w:r>
-        <w:rPr>
-          <w:rStyle w:val="VerbatimChar"/>
-          <w:lang w:val="es-ES"/>
-        </w:rPr>
-        <w:t xml:space="preserve">eval</w:t>
-      </w:r>
-      <w:r>
-        <w:rPr>
-          <w:lang w:val="es-ES"/>
-        </w:rPr>
-        <w:t xml:space="preserve"> </w:t>
-      </w:r>
-      <w:r>
-        <w:rPr>
-          <w:lang w:val="es-ES"/>
-        </w:rPr>
-        <w:t xml:space="preserve">por CDP; un texto transitorio «Pensando…» que con el respaldo dura milisegundos). Se diagnosticó cada una, se corrigió la prueba y se repitió hasta tener ejecuciones estables.</w:t>
-      </w:r>
-    </w:p>
-    <w:p>
-      <w:pPr>
-        <w:pStyle w:val="Compact"/>
-        <w:numPr>
-          <w:ilvl w:val="0"/>
-          <w:numId w:val="1008"/>
-        </w:numPr>
-      </w:pPr>
-      <w:r>
-        <w:rPr>
-          <w:b/>
-          <w:bCs/>
-          <w:lang w:val="es-ES"/>
-        </w:rPr>
-        <w:t xml:space="preserve">Tamaño del paquete.</w:t>
-      </w:r>
-      <w:r>
-        <w:rPr>
-          <w:lang w:val="es-ES"/>
-        </w:rPr>
-        <w:t xml:space="preserve"> </w:t>
-      </w:r>
-      <w:r>
-        <w:rPr>
-          <w:lang w:val="es-ES"/>
-        </w:rPr>
-        <w:t xml:space="preserve">El JavaScript ocupa 1,0 MB (268 KB comprimido), por encima del aviso de 500 KB de Vite. Es aceptable para una aplicación que se instala y usa sin conexión; la división por rutas (</w:t>
-      </w:r>
-      <w:r>
-        <w:rPr>
-          <w:i/>
-          <w:iCs/>
-          <w:lang w:val="es-ES"/>
-        </w:rPr>
-        <w:t xml:space="preserve">code splitting</w:t>
-      </w:r>
-      <w:r>
-        <w:rPr>
-          <w:lang w:val="es-ES"/>
-        </w:rPr>
-        <w:t xml:space="preserve">) queda como mejora.</w:t>
-      </w:r>
-    </w:p>
-    <w:p>
-      <w:r>
-        <w:pict>
-          <v:rect style="width:0;height:1.5pt" o:hralign="center" o:hrstd="t" o:hr="t"/>
-        </w:pict>
-      </w:r>
-    </w:p>
-    <w:p>
-      <w:pPr>
-        <w:pStyle w:val="Heading1"/>
-      </w:pPr>
-      <w:bookmarkStart w:id="67" w:name="_9fe372aa59c4bb0875237f6649bd884120daeaf"/>
-      <w:r>
-        <w:rPr>
-          <w:lang w:val="es-ES"/>
-        </w:rPr>
-        <w:t xml:space="preserve">12. Conclusiones, cumplimiento de objetivos y líneas futuras</w:t>
-      </w:r>
-      <w:bookmarkEnd w:id="67"/>
-    </w:p>
-    <w:p>
-      <w:pPr>
-        <w:pStyle w:val="Heading2"/>
-      </w:pPr>
-      <w:bookmarkStart w:id="68" w:name="_1992514e03816565542901f784711a971d33dd9"/>
-      <w:r>
-        <w:rPr>
-          <w:lang w:val="es-ES"/>
-        </w:rPr>
-        <w:t xml:space="preserve">12.1 Cumplimiento de objetivos</w:t>
-      </w:r>
-      <w:bookmarkEnd w:id="68"/>
+        <w:t xml:space="preserve">La auditoría encontró defectos reales que los tests unitarios no podían ver. Se corrigieron y la suite vuelve a pasar completa.</w:t>
+      </w:r>
     </w:p>
     <w:tbl>
       <w:tblPr>
@@ -12544,10 +11640,10 @@
         <w:tblLook w:firstRow="1" w:lastRow="0" w:firstColumn="0" w:lastColumn="0" w:noHBand="0" w:noVBand="0" w:val="0020"/>
       </w:tblPr>
       <w:tblGrid>
-        <w:gridCol w:w="688"/>
-        <w:gridCol w:w="2582"/>
-        <w:gridCol w:w="3099"/>
-        <w:gridCol w:w="1549"/>
+        <w:gridCol w:w="388"/>
+        <w:gridCol w:w="2720"/>
+        <w:gridCol w:w="2137"/>
+        <w:gridCol w:w="2672"/>
       </w:tblGrid>
       <w:tr>
         <w:trPr>
@@ -12577,35 +11673,35 @@
               <w:rPr>
                 <w:lang w:val="es-ES"/>
               </w:rPr>
-              <w:t xml:space="preserve">Objetivo</w:t>
-            </w:r>
-          </w:p>
-        </w:tc>
-        <w:tc>
-          <w:tcPr/>
-          <w:p>
-            <w:pPr>
-              <w:pStyle w:val="Compact"/>
-            </w:pPr>
-            <w:r>
-              <w:rPr>
-                <w:lang w:val="es-ES"/>
-              </w:rPr>
-              <w:t xml:space="preserve">Estado</w:t>
-            </w:r>
-          </w:p>
-        </w:tc>
-        <w:tc>
-          <w:tcPr/>
-          <w:p>
-            <w:pPr>
-              <w:pStyle w:val="Compact"/>
-            </w:pPr>
-            <w:r>
-              <w:rPr>
-                <w:lang w:val="es-ES"/>
-              </w:rPr>
-              <w:t xml:space="preserve">Evidencia</w:t>
+              <w:t xml:space="preserve">Defecto</w:t>
+            </w:r>
+          </w:p>
+        </w:tc>
+        <w:tc>
+          <w:tcPr/>
+          <w:p>
+            <w:pPr>
+              <w:pStyle w:val="Compact"/>
+            </w:pPr>
+            <w:r>
+              <w:rPr>
+                <w:lang w:val="es-ES"/>
+              </w:rPr>
+              <w:t xml:space="preserve">Causa</w:t>
+            </w:r>
+          </w:p>
+        </w:tc>
+        <w:tc>
+          <w:tcPr/>
+          <w:p>
+            <w:pPr>
+              <w:pStyle w:val="Compact"/>
+            </w:pPr>
+            <w:r>
+              <w:rPr>
+                <w:lang w:val="es-ES"/>
+              </w:rPr>
+              <w:t xml:space="preserve">Corrección</w:t>
             </w:r>
           </w:p>
         </w:tc>
@@ -12621,49 +11717,63 @@
               <w:rPr>
                 <w:lang w:val="es-ES"/>
               </w:rPr>
-              <w:t xml:space="preserve">O1</w:t>
-            </w:r>
-          </w:p>
-        </w:tc>
-        <w:tc>
-          <w:tcPr/>
-          <w:p>
-            <w:pPr>
-              <w:pStyle w:val="Compact"/>
-            </w:pPr>
-            <w:r>
-              <w:rPr>
-                <w:lang w:val="es-ES"/>
-              </w:rPr>
-              <w:t xml:space="preserve">Interfaz minimalista, responsive, sin scroll lateral</w:t>
-            </w:r>
-          </w:p>
-        </w:tc>
-        <w:tc>
-          <w:tcPr/>
-          <w:p>
-            <w:pPr>
-              <w:pStyle w:val="Compact"/>
-            </w:pPr>
-            <w:r>
-              <w:rPr>
-                <w:lang w:val="es-ES"/>
-              </w:rPr>
-              <w:t xml:space="preserve">✅ Cumplido</w:t>
-            </w:r>
-          </w:p>
-        </w:tc>
-        <w:tc>
-          <w:tcPr/>
-          <w:p>
-            <w:pPr>
-              <w:pStyle w:val="Compact"/>
-            </w:pPr>
-            <w:r>
-              <w:rPr>
-                <w:lang w:val="es-ES"/>
-              </w:rPr>
-              <w:t xml:space="preserve">E2E web a 1280 y 390 px</w:t>
+              <w:t xml:space="preserve">1</w:t>
+            </w:r>
+          </w:p>
+        </w:tc>
+        <w:tc>
+          <w:tcPr/>
+          <w:p>
+            <w:pPr>
+              <w:pStyle w:val="Compact"/>
+            </w:pPr>
+            <w:r>
+              <w:rPr>
+                <w:lang w:val="es-ES"/>
+              </w:rPr>
+              <w:t xml:space="preserve">Un doble clic en «Crear esta página» del asistente creaba</w:t>
+            </w:r>
+            <w:r>
+              <w:rPr>
+                <w:lang w:val="es-ES"/>
+              </w:rPr>
+              <w:t xml:space="preserve"> </w:t>
+            </w:r>
+            <w:r>
+              <w:rPr>
+                <w:b/>
+                <w:bCs/>
+                <w:lang w:val="es-ES"/>
+              </w:rPr>
+              <w:t xml:space="preserve">dos páginas</w:t>
+            </w:r>
+          </w:p>
+        </w:tc>
+        <w:tc>
+          <w:tcPr/>
+          <w:p>
+            <w:pPr>
+              <w:pStyle w:val="Compact"/>
+            </w:pPr>
+            <w:r>
+              <w:rPr>
+                <w:lang w:val="es-ES"/>
+              </w:rPr>
+              <w:t xml:space="preserve">El botón solo se deshabilitaba cuando terminaba la operación asíncrona (condición de carrera)</w:t>
+            </w:r>
+          </w:p>
+        </w:tc>
+        <w:tc>
+          <w:tcPr/>
+          <w:p>
+            <w:pPr>
+              <w:pStyle w:val="Compact"/>
+            </w:pPr>
+            <w:r>
+              <w:rPr>
+                <w:lang w:val="es-ES"/>
+              </w:rPr>
+              <w:t xml:space="preserve">Registro de propuestas en curso que ignora el segundo clic</w:t>
             </w:r>
           </w:p>
         </w:tc>
@@ -12679,49 +11789,76 @@
               <w:rPr>
                 <w:lang w:val="es-ES"/>
               </w:rPr>
-              <w:t xml:space="preserve">O2</w:t>
-            </w:r>
-          </w:p>
-        </w:tc>
-        <w:tc>
-          <w:tcPr/>
-          <w:p>
-            <w:pPr>
-              <w:pStyle w:val="Compact"/>
-            </w:pPr>
-            <w:r>
-              <w:rPr>
-                <w:lang w:val="es-ES"/>
-              </w:rPr>
-              <w:t xml:space="preserve">Autenticación y aislamiento por usuario</w:t>
-            </w:r>
-          </w:p>
-        </w:tc>
-        <w:tc>
-          <w:tcPr/>
-          <w:p>
-            <w:pPr>
-              <w:pStyle w:val="Compact"/>
-            </w:pPr>
-            <w:r>
-              <w:rPr>
-                <w:lang w:val="es-ES"/>
-              </w:rPr>
-              <w:t xml:space="preserve">✅ Cumplido en el modo Local-First; adaptador Firebase/Google implementado (despliegue cloud: línea futura)</w:t>
-            </w:r>
-          </w:p>
-        </w:tc>
-        <w:tc>
-          <w:tcPr/>
-          <w:p>
-            <w:pPr>
-              <w:pStyle w:val="Compact"/>
-            </w:pPr>
-            <w:r>
-              <w:rPr>
-                <w:lang w:val="es-ES"/>
-              </w:rPr>
-              <w:t xml:space="preserve">11 tests + E2E</w:t>
+              <w:t xml:space="preserve">2</w:t>
+            </w:r>
+          </w:p>
+        </w:tc>
+        <w:tc>
+          <w:tcPr/>
+          <w:p>
+            <w:pPr>
+              <w:pStyle w:val="Compact"/>
+            </w:pPr>
+            <w:r>
+              <w:rPr>
+                <w:lang w:val="es-ES"/>
+              </w:rPr>
+              <w:t xml:space="preserve">Clics muy rápidos en «+» podían duplicar páginas o</w:t>
+            </w:r>
+            <w:r>
+              <w:rPr>
+                <w:lang w:val="es-ES"/>
+              </w:rPr>
+              <w:t xml:space="preserve"> </w:t>
+            </w:r>
+            <w:r>
+              <w:rPr>
+                <w:b/>
+                <w:bCs/>
+                <w:lang w:val="es-ES"/>
+              </w:rPr>
+              <w:t xml:space="preserve">superar el límite del plan Free</w:t>
+            </w:r>
+          </w:p>
+        </w:tc>
+        <w:tc>
+          <w:tcPr/>
+          <w:p>
+            <w:pPr>
+              <w:pStyle w:val="Compact"/>
+            </w:pPr>
+            <w:r>
+              <w:rPr>
+                <w:lang w:val="es-ES"/>
+              </w:rPr>
+              <w:t xml:space="preserve">La comprobación del límite usaba una lista de páginas aún sin actualizar</w:t>
+            </w:r>
+          </w:p>
+        </w:tc>
+        <w:tc>
+          <w:tcPr/>
+          <w:p>
+            <w:pPr>
+              <w:pStyle w:val="Compact"/>
+            </w:pPr>
+            <w:r>
+              <w:rPr>
+                <w:lang w:val="es-ES"/>
+              </w:rPr>
+              <w:t xml:space="preserve">Cerrojo de creación en curso en</w:t>
+            </w:r>
+            <w:r>
+              <w:rPr>
+                <w:lang w:val="es-ES"/>
+              </w:rPr>
+              <w:t xml:space="preserve"> </w:t>
+            </w:r>
+            <w:r>
+              <w:rPr>
+                <w:rStyle w:val="VerbatimChar"/>
+                <w:lang w:val="es-ES"/>
+              </w:rPr>
+              <w:t xml:space="preserve">Layout</w:t>
             </w:r>
           </w:p>
         </w:tc>
@@ -12737,49 +11874,63 @@
               <w:rPr>
                 <w:lang w:val="es-ES"/>
               </w:rPr>
-              <w:t xml:space="preserve">O3</w:t>
-            </w:r>
-          </w:p>
-        </w:tc>
-        <w:tc>
-          <w:tcPr/>
-          <w:p>
-            <w:pPr>
-              <w:pStyle w:val="Compact"/>
-            </w:pPr>
-            <w:r>
-              <w:rPr>
-                <w:lang w:val="es-ES"/>
-              </w:rPr>
-              <w:t xml:space="preserve">CRUD completo en tiempo real</w:t>
-            </w:r>
-          </w:p>
-        </w:tc>
-        <w:tc>
-          <w:tcPr/>
-          <w:p>
-            <w:pPr>
-              <w:pStyle w:val="Compact"/>
-            </w:pPr>
-            <w:r>
-              <w:rPr>
-                <w:lang w:val="es-ES"/>
-              </w:rPr>
-              <w:t xml:space="preserve">✅ Cumplido</w:t>
-            </w:r>
-          </w:p>
-        </w:tc>
-        <w:tc>
-          <w:tcPr/>
-          <w:p>
-            <w:pPr>
-              <w:pStyle w:val="Compact"/>
-            </w:pPr>
-            <w:r>
-              <w:rPr>
-                <w:lang w:val="es-ES"/>
-              </w:rPr>
-              <w:t xml:space="preserve">Tests + E2E</w:t>
+              <w:t xml:space="preserve">3</w:t>
+            </w:r>
+          </w:p>
+        </w:tc>
+        <w:tc>
+          <w:tcPr/>
+          <w:p>
+            <w:pPr>
+              <w:pStyle w:val="Compact"/>
+            </w:pPr>
+            <w:r>
+              <w:rPr>
+                <w:lang w:val="es-ES"/>
+              </w:rPr>
+              <w:t xml:space="preserve">Al alcanzar el límite Free se abría el modal de planes</w:t>
+            </w:r>
+            <w:r>
+              <w:rPr>
+                <w:lang w:val="es-ES"/>
+              </w:rPr>
+              <w:t xml:space="preserve"> </w:t>
+            </w:r>
+            <w:r>
+              <w:rPr>
+                <w:b/>
+                <w:bCs/>
+                <w:lang w:val="es-ES"/>
+              </w:rPr>
+              <w:t xml:space="preserve">sin explicar el motivo</w:t>
+            </w:r>
+          </w:p>
+        </w:tc>
+        <w:tc>
+          <w:tcPr/>
+          <w:p>
+            <w:pPr>
+              <w:pStyle w:val="Compact"/>
+            </w:pPr>
+            <w:r>
+              <w:rPr>
+                <w:lang w:val="es-ES"/>
+              </w:rPr>
+              <w:t xml:space="preserve">El modal no recibía la causa</w:t>
+            </w:r>
+          </w:p>
+        </w:tc>
+        <w:tc>
+          <w:tcPr/>
+          <w:p>
+            <w:pPr>
+              <w:pStyle w:val="Compact"/>
+            </w:pPr>
+            <w:r>
+              <w:rPr>
+                <w:lang w:val="es-ES"/>
+              </w:rPr>
+              <w:t xml:space="preserve">Aviso explícito: «Has alcanzado el límite del plan Free: 3 páginas…»</w:t>
             </w:r>
           </w:p>
         </w:tc>
@@ -12795,49 +11946,63 @@
               <w:rPr>
                 <w:lang w:val="es-ES"/>
               </w:rPr>
-              <w:t xml:space="preserve">O4</w:t>
-            </w:r>
-          </w:p>
-        </w:tc>
-        <w:tc>
-          <w:tcPr/>
-          <w:p>
-            <w:pPr>
-              <w:pStyle w:val="Compact"/>
-            </w:pPr>
-            <w:r>
-              <w:rPr>
-                <w:lang w:val="es-ES"/>
-              </w:rPr>
-              <w:t xml:space="preserve">Diseño de datos, reglas y alternativa local</w:t>
-            </w:r>
-          </w:p>
-        </w:tc>
-        <w:tc>
-          <w:tcPr/>
-          <w:p>
-            <w:pPr>
-              <w:pStyle w:val="Compact"/>
-            </w:pPr>
-            <w:r>
-              <w:rPr>
-                <w:lang w:val="es-ES"/>
-              </w:rPr>
-              <w:t xml:space="preserve">✅ Cumplido (reglas de Firestore incluidas como arquitectura extensible)</w:t>
-            </w:r>
-          </w:p>
-        </w:tc>
-        <w:tc>
-          <w:tcPr/>
-          <w:p>
-            <w:pPr>
-              <w:pStyle w:val="Compact"/>
-            </w:pPr>
-            <w:r>
-              <w:rPr>
-                <w:lang w:val="es-ES"/>
-              </w:rPr>
-              <w:t xml:space="preserve">Sección 5</w:t>
+              <w:t xml:space="preserve">4</w:t>
+            </w:r>
+          </w:p>
+        </w:tc>
+        <w:tc>
+          <w:tcPr/>
+          <w:p>
+            <w:pPr>
+              <w:pStyle w:val="Compact"/>
+            </w:pPr>
+            <w:r>
+              <w:rPr>
+                <w:lang w:val="es-ES"/>
+              </w:rPr>
+              <w:t xml:space="preserve">En el calendario, pulsar un día</w:t>
+            </w:r>
+            <w:r>
+              <w:rPr>
+                <w:lang w:val="es-ES"/>
+              </w:rPr>
+              <w:t xml:space="preserve"> </w:t>
+            </w:r>
+            <w:r>
+              <w:rPr>
+                <w:b/>
+                <w:bCs/>
+                <w:lang w:val="es-ES"/>
+              </w:rPr>
+              <w:t xml:space="preserve">no hacía nada</w:t>
+            </w:r>
+          </w:p>
+        </w:tc>
+        <w:tc>
+          <w:tcPr/>
+          <w:p>
+            <w:pPr>
+              <w:pStyle w:val="Compact"/>
+            </w:pPr>
+            <w:r>
+              <w:rPr>
+                <w:lang w:val="es-ES"/>
+              </w:rPr>
+              <w:t xml:space="preserve">Los días eran elementos no interactivos</w:t>
+            </w:r>
+          </w:p>
+        </w:tc>
+        <w:tc>
+          <w:tcPr/>
+          <w:p>
+            <w:pPr>
+              <w:pStyle w:val="Compact"/>
+            </w:pPr>
+            <w:r>
+              <w:rPr>
+                <w:lang w:val="es-ES"/>
+              </w:rPr>
+              <w:t xml:space="preserve">Cada día es un botón que muestra sus hábitos hechos y pendientes y la nota; un test lo contrasta con los datos reales</w:t>
             </w:r>
           </w:p>
         </w:tc>
@@ -12853,49 +12018,82 @@
               <w:rPr>
                 <w:lang w:val="es-ES"/>
               </w:rPr>
-              <w:t xml:space="preserve">O5</w:t>
-            </w:r>
-          </w:p>
-        </w:tc>
-        <w:tc>
-          <w:tcPr/>
-          <w:p>
-            <w:pPr>
-              <w:pStyle w:val="Compact"/>
-            </w:pPr>
-            <w:r>
-              <w:rPr>
-                <w:lang w:val="es-ES"/>
-              </w:rPr>
-              <w:t xml:space="preserve">API en PHP que oculte la clave</w:t>
-            </w:r>
-          </w:p>
-        </w:tc>
-        <w:tc>
-          <w:tcPr/>
-          <w:p>
-            <w:pPr>
-              <w:pStyle w:val="Compact"/>
-            </w:pPr>
-            <w:r>
-              <w:rPr>
-                <w:lang w:val="es-ES"/>
-              </w:rPr>
-              <w:t xml:space="preserve">✅ Cumplido</w:t>
-            </w:r>
-          </w:p>
-        </w:tc>
-        <w:tc>
-          <w:tcPr/>
-          <w:p>
-            <w:pPr>
-              <w:pStyle w:val="Compact"/>
-            </w:pPr>
-            <w:r>
-              <w:rPr>
-                <w:lang w:val="es-ES"/>
-              </w:rPr>
-              <w:t xml:space="preserve">11 peticiones + prueba real con Gemini</w:t>
+              <w:t xml:space="preserve">5</w:t>
+            </w:r>
+          </w:p>
+        </w:tc>
+        <w:tc>
+          <w:tcPr/>
+          <w:p>
+            <w:pPr>
+              <w:pStyle w:val="Compact"/>
+            </w:pPr>
+            <w:r>
+              <w:rPr>
+                <w:lang w:val="es-ES"/>
+              </w:rPr>
+              <w:t xml:space="preserve">El buscador</w:t>
+            </w:r>
+            <w:r>
+              <w:rPr>
+                <w:lang w:val="es-ES"/>
+              </w:rPr>
+              <w:t xml:space="preserve"> </w:t>
+            </w:r>
+            <w:r>
+              <w:rPr>
+                <w:rStyle w:val="VerbatimChar"/>
+                <w:lang w:val="es-ES"/>
+              </w:rPr>
+              <w:t xml:space="preserve">Ctrl+K</w:t>
+            </w:r>
+            <w:r>
+              <w:rPr>
+                <w:lang w:val="es-ES"/>
+              </w:rPr>
+              <w:t xml:space="preserve"> </w:t>
+            </w:r>
+            <w:r>
+              <w:rPr>
+                <w:b/>
+                <w:bCs/>
+                <w:lang w:val="es-ES"/>
+              </w:rPr>
+              <w:t xml:space="preserve">solo encontraba páginas</w:t>
+            </w:r>
+            <w:r>
+              <w:rPr>
+                <w:lang w:val="es-ES"/>
+              </w:rPr>
+              <w:t xml:space="preserve">, no hábitos</w:t>
+            </w:r>
+          </w:p>
+        </w:tc>
+        <w:tc>
+          <w:tcPr/>
+          <w:p>
+            <w:pPr>
+              <w:pStyle w:val="Compact"/>
+            </w:pPr>
+            <w:r>
+              <w:rPr>
+                <w:lang w:val="es-ES"/>
+              </w:rPr>
+              <w:t xml:space="preserve">Solo se indexaban los títulos de página</w:t>
+            </w:r>
+          </w:p>
+        </w:tc>
+        <w:tc>
+          <w:tcPr/>
+          <w:p>
+            <w:pPr>
+              <w:pStyle w:val="Compact"/>
+            </w:pPr>
+            <w:r>
+              <w:rPr>
+                <w:lang w:val="es-ES"/>
+              </w:rPr>
+              <w:t xml:space="preserve">Los hábitos se indexan por nombre y llevan a su página</w:t>
             </w:r>
           </w:p>
         </w:tc>
@@ -12911,49 +12109,1227 @@
               <w:rPr>
                 <w:lang w:val="es-ES"/>
               </w:rPr>
-              <w:t xml:space="preserve">O6</w:t>
-            </w:r>
-          </w:p>
-        </w:tc>
-        <w:tc>
-          <w:tcPr/>
-          <w:p>
-            <w:pPr>
-              <w:pStyle w:val="Compact"/>
-            </w:pPr>
-            <w:r>
-              <w:rPr>
-                <w:lang w:val="es-ES"/>
-              </w:rPr>
-              <w:t xml:space="preserve">Asistente con contexto y respaldo</w:t>
-            </w:r>
-          </w:p>
-        </w:tc>
-        <w:tc>
-          <w:tcPr/>
-          <w:p>
-            <w:pPr>
-              <w:pStyle w:val="Compact"/>
-            </w:pPr>
-            <w:r>
-              <w:rPr>
-                <w:lang w:val="es-ES"/>
-              </w:rPr>
-              <w:t xml:space="preserve">✅ Cumplido</w:t>
-            </w:r>
-          </w:p>
-        </w:tc>
-        <w:tc>
-          <w:tcPr/>
-          <w:p>
-            <w:pPr>
-              <w:pStyle w:val="Compact"/>
-            </w:pPr>
-            <w:r>
-              <w:rPr>
-                <w:lang w:val="es-ES"/>
-              </w:rPr>
-              <w:t xml:space="preserve">E2E + tests</w:t>
+              <w:t xml:space="preserve">6</w:t>
+            </w:r>
+          </w:p>
+        </w:tc>
+        <w:tc>
+          <w:tcPr/>
+          <w:p>
+            <w:pPr>
+              <w:pStyle w:val="Compact"/>
+            </w:pPr>
+            <w:r>
+              <w:rPr>
+                <w:lang w:val="es-ES"/>
+              </w:rPr>
+              <w:t xml:space="preserve">Avisos repetidos de React Router en la consola (66 mensajes)</w:t>
+            </w:r>
+          </w:p>
+        </w:tc>
+        <w:tc>
+          <w:tcPr/>
+          <w:p>
+            <w:pPr>
+              <w:pStyle w:val="Compact"/>
+            </w:pPr>
+            <w:r>
+              <w:rPr>
+                <w:lang w:val="es-ES"/>
+              </w:rPr>
+              <w:t xml:space="preserve">Banderas de la v7 sin activar</w:t>
+            </w:r>
+          </w:p>
+        </w:tc>
+        <w:tc>
+          <w:tcPr/>
+          <w:p>
+            <w:pPr>
+              <w:pStyle w:val="Compact"/>
+            </w:pPr>
+            <w:r>
+              <w:rPr>
+                <w:rStyle w:val="VerbatimChar"/>
+                <w:lang w:val="es-ES"/>
+              </w:rPr>
+              <w:t xml:space="preserve">future</w:t>
+            </w:r>
+            <w:r>
+              <w:rPr>
+                <w:lang w:val="es-ES"/>
+              </w:rPr>
+              <w:t xml:space="preserve"> </w:t>
+            </w:r>
+            <w:r>
+              <w:rPr>
+                <w:lang w:val="es-ES"/>
+              </w:rPr>
+              <w:t xml:space="preserve">flags activadas en el enrutador</w:t>
+            </w:r>
+          </w:p>
+        </w:tc>
+      </w:tr>
+    </w:tbl>
+    <w:p>
+      <w:pPr>
+        <w:pStyle w:val="FirstParagraph"/>
+      </w:pPr>
+      <w:r>
+        <w:rPr>
+          <w:lang w:val="es-ES"/>
+        </w:rPr>
+        <w:t xml:space="preserve">Además se descartaron falsos positivos propios de la prueba (por ejemplo, selectores que coincidían con la cabecera de la aplicación y no con la de la página); no se cuentan como defectos de la aplicación.</w:t>
+      </w:r>
+    </w:p>
+    <w:p>
+      <w:pPr>
+        <w:pStyle w:val="BodyText"/>
+      </w:pPr>
+      <w:r>
+        <w:rPr>
+          <w:b/>
+          <w:bCs/>
+          <w:lang w:val="es-ES"/>
+        </w:rPr>
+        <w:t xml:space="preserve">PWA, 11 pasos</w:t>
+      </w:r>
+      <w:r>
+        <w:rPr>
+          <w:lang w:val="es-ES"/>
+        </w:rPr>
+        <w:t xml:space="preserve"> </w:t>
+      </w:r>
+      <w:r>
+        <w:rPr>
+          <w:lang w:val="es-ES"/>
+        </w:rPr>
+        <w:t xml:space="preserve">(</w:t>
+      </w:r>
+      <w:r>
+        <w:rPr>
+          <w:rStyle w:val="VerbatimChar"/>
+          <w:lang w:val="es-ES"/>
+        </w:rPr>
+        <w:t xml:space="preserve">e2e/pwa.mjs</w:t>
+      </w:r>
+      <w:r>
+        <w:rPr>
+          <w:lang w:val="es-ES"/>
+        </w:rPr>
+        <w:t xml:space="preserve">): manifest e iconos válidos;</w:t>
+      </w:r>
+      <w:r>
+        <w:rPr>
+          <w:lang w:val="es-ES"/>
+        </w:rPr>
+        <w:t xml:space="preserve"> </w:t>
+      </w:r>
+      <w:r>
+        <w:rPr>
+          <w:b/>
+          <w:bCs/>
+          <w:lang w:val="es-ES"/>
+        </w:rPr>
+        <w:t xml:space="preserve">Chrome no detecta errores de instalabilidad</w:t>
+      </w:r>
+      <w:r>
+        <w:rPr>
+          <w:lang w:val="es-ES"/>
+        </w:rPr>
+        <w:t xml:space="preserve">; el Service Worker toma el control; el</w:t>
+      </w:r>
+      <w:r>
+        <w:rPr>
+          <w:lang w:val="es-ES"/>
+        </w:rPr>
+        <w:t xml:space="preserve"> </w:t>
+      </w:r>
+      <w:r>
+        <w:rPr>
+          <w:i/>
+          <w:iCs/>
+          <w:lang w:val="es-ES"/>
+        </w:rPr>
+        <w:t xml:space="preserve">app shell</w:t>
+      </w:r>
+      <w:r>
+        <w:rPr>
+          <w:lang w:val="es-ES"/>
+        </w:rPr>
+        <w:t xml:space="preserve"> </w:t>
+      </w:r>
+      <w:r>
+        <w:rPr>
+          <w:lang w:val="es-ES"/>
+        </w:rPr>
+        <w:t xml:space="preserve">queda en caché;</w:t>
+      </w:r>
+      <w:r>
+        <w:rPr>
+          <w:lang w:val="es-ES"/>
+        </w:rPr>
+        <w:t xml:space="preserve"> </w:t>
+      </w:r>
+      <w:r>
+        <w:rPr>
+          <w:b/>
+          <w:bCs/>
+          <w:lang w:val="es-ES"/>
+        </w:rPr>
+        <w:t xml:space="preserve">sin conexión</w:t>
+      </w:r>
+      <w:r>
+        <w:rPr>
+          <w:lang w:val="es-ES"/>
+        </w:rPr>
+        <w:t xml:space="preserve">: arranque, uso de la app, recarga en una ruta profunda y asistente en modo de respaldo;</w:t>
+      </w:r>
+      <w:r>
+        <w:rPr>
+          <w:lang w:val="es-ES"/>
+        </w:rPr>
+        <w:t xml:space="preserve"> </w:t>
+      </w:r>
+      <w:r>
+        <w:rPr>
+          <w:rStyle w:val="VerbatimChar"/>
+          <w:lang w:val="es-ES"/>
+        </w:rPr>
+        <w:t xml:space="preserve">/api/</w:t>
+      </w:r>
+      <w:r>
+        <w:rPr>
+          <w:lang w:val="es-ES"/>
+        </w:rPr>
+        <w:t xml:space="preserve"> </w:t>
+      </w:r>
+      <w:r>
+        <w:rPr>
+          <w:lang w:val="es-ES"/>
+        </w:rPr>
+        <w:t xml:space="preserve">nunca en caché; sin desbordamiento en móvil.</w:t>
+      </w:r>
+    </w:p>
+    <w:p>
+      <w:pPr>
+        <w:pStyle w:val="BodyText"/>
+      </w:pPr>
+      <w:r>
+        <w:rPr>
+          <w:b/>
+          <w:bCs/>
+          <w:lang w:val="es-ES"/>
+        </w:rPr>
+        <w:t xml:space="preserve">Electron, 16 pasos</w:t>
+      </w:r>
+      <w:r>
+        <w:rPr>
+          <w:lang w:val="es-ES"/>
+        </w:rPr>
+        <w:t xml:space="preserve"> </w:t>
+      </w:r>
+      <w:r>
+        <w:rPr>
+          <w:lang w:val="es-ES"/>
+        </w:rPr>
+        <w:t xml:space="preserve">(</w:t>
+      </w:r>
+      <w:r>
+        <w:rPr>
+          <w:rStyle w:val="VerbatimChar"/>
+          <w:lang w:val="es-ES"/>
+        </w:rPr>
+        <w:t xml:space="preserve">e2e/electron.mjs</w:t>
+      </w:r>
+      <w:r>
+        <w:rPr>
+          <w:lang w:val="es-ES"/>
+        </w:rPr>
+        <w:t xml:space="preserve">; se ejecutan tanto con</w:t>
+      </w:r>
+      <w:r>
+        <w:rPr>
+          <w:lang w:val="es-ES"/>
+        </w:rPr>
+        <w:t xml:space="preserve"> </w:t>
+      </w:r>
+      <w:r>
+        <w:rPr>
+          <w:rStyle w:val="VerbatimChar"/>
+          <w:lang w:val="es-ES"/>
+        </w:rPr>
+        <w:t xml:space="preserve">electron .</w:t>
+      </w:r>
+      <w:r>
+        <w:rPr>
+          <w:lang w:val="es-ES"/>
+        </w:rPr>
+        <w:t xml:space="preserve"> </w:t>
+      </w:r>
+      <w:r>
+        <w:rPr>
+          <w:lang w:val="es-ES"/>
+        </w:rPr>
+        <w:t xml:space="preserve">como contra el</w:t>
+      </w:r>
+      <w:r>
+        <w:rPr>
+          <w:lang w:val="es-ES"/>
+        </w:rPr>
+        <w:t xml:space="preserve"> </w:t>
+      </w:r>
+      <w:r>
+        <w:rPr>
+          <w:rStyle w:val="VerbatimChar"/>
+          <w:lang w:val="es-ES"/>
+        </w:rPr>
+        <w:t xml:space="preserve">.exe</w:t>
+      </w:r>
+      <w:r>
+        <w:rPr>
+          <w:lang w:val="es-ES"/>
+        </w:rPr>
+        <w:t xml:space="preserve"> </w:t>
+      </w:r>
+      <w:r>
+        <w:rPr>
+          <w:lang w:val="es-ES"/>
+        </w:rPr>
+        <w:t xml:space="preserve">empaquetado): carga por</w:t>
+      </w:r>
+      <w:r>
+        <w:rPr>
+          <w:lang w:val="es-ES"/>
+        </w:rPr>
+        <w:t xml:space="preserve"> </w:t>
+      </w:r>
+      <w:r>
+        <w:rPr>
+          <w:rStyle w:val="VerbatimChar"/>
+          <w:lang w:val="es-ES"/>
+        </w:rPr>
+        <w:t xml:space="preserve">app://</w:t>
+      </w:r>
+      <w:r>
+        <w:rPr>
+          <w:lang w:val="es-ES"/>
+        </w:rPr>
+        <w:t xml:space="preserve">;</w:t>
+      </w:r>
+      <w:r>
+        <w:rPr>
+          <w:lang w:val="es-ES"/>
+        </w:rPr>
+        <w:t xml:space="preserve"> </w:t>
+      </w:r>
+      <w:r>
+        <w:rPr>
+          <w:b/>
+          <w:bCs/>
+          <w:lang w:val="es-ES"/>
+        </w:rPr>
+        <w:t xml:space="preserve">sin</w:t>
+      </w:r>
+      <w:r>
+        <w:rPr>
+          <w:b/>
+          <w:bCs/>
+          <w:lang w:val="es-ES"/>
+        </w:rPr>
+        <w:t xml:space="preserve"> </w:t>
+      </w:r>
+      <w:r>
+        <w:rPr>
+          <w:rStyle w:val="VerbatimChar"/>
+          <w:b/>
+          <w:bCs/>
+          <w:lang w:val="es-ES"/>
+        </w:rPr>
+        <w:t xml:space="preserve">require</w:t>
+      </w:r>
+      <w:r>
+        <w:rPr>
+          <w:b/>
+          <w:bCs/>
+          <w:lang w:val="es-ES"/>
+        </w:rPr>
+        <w:t xml:space="preserve">,</w:t>
+      </w:r>
+      <w:r>
+        <w:rPr>
+          <w:b/>
+          <w:bCs/>
+          <w:lang w:val="es-ES"/>
+        </w:rPr>
+        <w:t xml:space="preserve"> </w:t>
+      </w:r>
+      <w:r>
+        <w:rPr>
+          <w:rStyle w:val="VerbatimChar"/>
+          <w:b/>
+          <w:bCs/>
+          <w:lang w:val="es-ES"/>
+        </w:rPr>
+        <w:t xml:space="preserve">process</w:t>
+      </w:r>
+      <w:r>
+        <w:rPr>
+          <w:b/>
+          <w:bCs/>
+          <w:lang w:val="es-ES"/>
+        </w:rPr>
+        <w:t xml:space="preserve"> </w:t>
+      </w:r>
+      <w:r>
+        <w:rPr>
+          <w:b/>
+          <w:bCs/>
+          <w:lang w:val="es-ES"/>
+        </w:rPr>
+        <w:t xml:space="preserve">ni</w:t>
+      </w:r>
+      <w:r>
+        <w:rPr>
+          <w:b/>
+          <w:bCs/>
+          <w:lang w:val="es-ES"/>
+        </w:rPr>
+        <w:t xml:space="preserve"> </w:t>
+      </w:r>
+      <w:r>
+        <w:rPr>
+          <w:rStyle w:val="VerbatimChar"/>
+          <w:b/>
+          <w:bCs/>
+          <w:lang w:val="es-ES"/>
+        </w:rPr>
+        <w:t xml:space="preserve">Buffer</w:t>
+      </w:r>
+      <w:r>
+        <w:rPr>
+          <w:lang w:val="es-ES"/>
+        </w:rPr>
+        <w:t xml:space="preserve"> </w:t>
+      </w:r>
+      <w:r>
+        <w:rPr>
+          <w:lang w:val="es-ES"/>
+        </w:rPr>
+        <w:t xml:space="preserve">en la página;</w:t>
+      </w:r>
+      <w:r>
+        <w:rPr>
+          <w:lang w:val="es-ES"/>
+        </w:rPr>
+        <w:t xml:space="preserve"> </w:t>
+      </w:r>
+      <w:r>
+        <w:rPr>
+          <w:rStyle w:val="VerbatimChar"/>
+          <w:lang w:val="es-ES"/>
+        </w:rPr>
+        <w:t xml:space="preserve">contextBridge</w:t>
+      </w:r>
+      <w:r>
+        <w:rPr>
+          <w:lang w:val="es-ES"/>
+        </w:rPr>
+        <w:t xml:space="preserve"> </w:t>
+      </w:r>
+      <w:r>
+        <w:rPr>
+          <w:lang w:val="es-ES"/>
+        </w:rPr>
+        <w:t xml:space="preserve">de solo lectura;</w:t>
+      </w:r>
+      <w:r>
+        <w:rPr>
+          <w:lang w:val="es-ES"/>
+        </w:rPr>
+        <w:t xml:space="preserve"> </w:t>
+      </w:r>
+      <w:r>
+        <w:rPr>
+          <w:b/>
+          <w:bCs/>
+          <w:lang w:val="es-ES"/>
+        </w:rPr>
+        <w:t xml:space="preserve">CSP bloquea scripts en línea y</w:t>
+      </w:r>
+      <w:r>
+        <w:rPr>
+          <w:b/>
+          <w:bCs/>
+          <w:lang w:val="es-ES"/>
+        </w:rPr>
+        <w:t xml:space="preserve"> </w:t>
+      </w:r>
+      <w:r>
+        <w:rPr>
+          <w:rStyle w:val="VerbatimChar"/>
+          <w:b/>
+          <w:bCs/>
+          <w:lang w:val="es-ES"/>
+        </w:rPr>
+        <w:t xml:space="preserve">eval</w:t>
+      </w:r>
+      <w:r>
+        <w:rPr>
+          <w:lang w:val="es-ES"/>
+        </w:rPr>
+        <w:t xml:space="preserve">; sin</w:t>
+      </w:r>
+      <w:r>
+        <w:rPr>
+          <w:lang w:val="es-ES"/>
+        </w:rPr>
+        <w:t xml:space="preserve"> </w:t>
+      </w:r>
+      <w:r>
+        <w:rPr>
+          <w:i/>
+          <w:iCs/>
+          <w:lang w:val="es-ES"/>
+        </w:rPr>
+        <w:t xml:space="preserve">path traversal</w:t>
+      </w:r>
+      <w:r>
+        <w:rPr>
+          <w:lang w:val="es-ES"/>
+        </w:rPr>
+        <w:t xml:space="preserve">; proxy restringido a una ruta; uso completo de la aplicación; recarga en ruta profunda; ventana nueva y navegación externa bloqueadas.</w:t>
+      </w:r>
+    </w:p>
+    <w:p>
+      <w:pPr>
+        <w:pStyle w:val="Heading2"/>
+      </w:pPr>
+      <w:bookmarkStart w:id="66" w:name="_49a66ba4d60b94f9795291e563ee7b27cbe98a0"/>
+      <w:r>
+        <w:rPr>
+          <w:lang w:val="es-ES"/>
+        </w:rPr>
+        <w:t xml:space="preserve">10.3 Qué no cubren las pruebas</w:t>
+      </w:r>
+      <w:bookmarkEnd w:id="66"/>
+    </w:p>
+    <w:p>
+      <w:pPr>
+        <w:pStyle w:val="FirstParagraph"/>
+      </w:pPr>
+      <w:r>
+        <w:rPr>
+          <w:lang w:val="es-ES"/>
+        </w:rPr>
+        <w:t xml:space="preserve">Las pruebas validan el modo principal Local-First en la web, la PWA y Electron. Quedan fuera del alcance verificado, por pertenecer a la</w:t>
+      </w:r>
+      <w:r>
+        <w:rPr>
+          <w:lang w:val="es-ES"/>
+        </w:rPr>
+        <w:t xml:space="preserve"> </w:t>
+      </w:r>
+      <w:r>
+        <w:rPr>
+          <w:lang w:val="es-ES"/>
+        </w:rPr>
+        <w:t xml:space="preserve">fase de despliegue cloud: los adaptadores de Firebase (autenticación, reglas contra el emulador oficial e inicio de sesión con Google),</w:t>
+      </w:r>
+      <w:r>
+        <w:rPr>
+          <w:lang w:val="es-ES"/>
+        </w:rPr>
+        <w:t xml:space="preserve"> </w:t>
+      </w:r>
+      <w:r>
+        <w:rPr>
+          <w:lang w:val="es-ES"/>
+        </w:rPr>
+        <w:t xml:space="preserve">la compilación del APK/IPA y la calidad de las respuestas de la IA, que no es determinista. Se recogen como línea futura (sección 12.3).</w:t>
+      </w:r>
+    </w:p>
+    <w:p>
+      <w:r>
+        <w:pict>
+          <v:rect style="width:0;height:1.5pt" o:hralign="center" o:hrstd="t" o:hr="t"/>
+        </w:pict>
+      </w:r>
+    </w:p>
+    <w:p>
+      <w:pPr>
+        <w:pStyle w:val="Heading1"/>
+      </w:pPr>
+      <w:bookmarkStart w:id="67" w:name="_37019a45c8b34b51a647273f001b1ab578066b2"/>
+      <w:r>
+        <w:rPr>
+          <w:lang w:val="es-ES"/>
+        </w:rPr>
+        <w:t xml:space="preserve">11. Problemas encontrados y decisiones</w:t>
+      </w:r>
+      <w:bookmarkEnd w:id="67"/>
+    </w:p>
+    <w:p>
+      <w:pPr>
+        <w:pStyle w:val="FirstParagraph"/>
+      </w:pPr>
+      <w:r>
+        <w:rPr>
+          <w:lang w:val="es-ES"/>
+        </w:rPr>
+        <w:t xml:space="preserve">Esta sección recoge incidencias reales del proceso, porque las decisiones técnicas razonadas son parte del valor del trabajo.</w:t>
+      </w:r>
+    </w:p>
+    <w:p>
+      <w:pPr>
+        <w:pStyle w:val="Compact"/>
+        <w:numPr>
+          <w:ilvl w:val="0"/>
+          <w:numId w:val="1008"/>
+        </w:numPr>
+      </w:pPr>
+      <w:r>
+        <w:rPr>
+          <w:b/>
+          <w:bCs/>
+          <w:lang w:val="es-ES"/>
+        </w:rPr>
+        <w:t xml:space="preserve">Alcance.</w:t>
+      </w:r>
+      <w:r>
+        <w:rPr>
+          <w:lang w:val="es-ES"/>
+        </w:rPr>
+        <w:t xml:space="preserve"> </w:t>
+      </w:r>
+      <w:r>
+        <w:rPr>
+          <w:lang w:val="es-ES"/>
+        </w:rPr>
+        <w:t xml:space="preserve">La idea inicial (asistente de IA general) se sustituyó por un rastreador de hábitos concreto y completable, conservando una versión de respaldo en PHP/MySQL.</w:t>
+      </w:r>
+    </w:p>
+    <w:p>
+      <w:pPr>
+        <w:pStyle w:val="Compact"/>
+        <w:numPr>
+          <w:ilvl w:val="0"/>
+          <w:numId w:val="1008"/>
+        </w:numPr>
+      </w:pPr>
+      <w:r>
+        <w:rPr>
+          <w:b/>
+          <w:bCs/>
+          <w:lang w:val="es-ES"/>
+        </w:rPr>
+        <w:t xml:space="preserve">Persistencia dual y enfoque Local-First.</w:t>
+      </w:r>
+      <w:r>
+        <w:rPr>
+          <w:lang w:val="es-ES"/>
+        </w:rPr>
+        <w:t xml:space="preserve"> </w:t>
+      </w:r>
+      <w:r>
+        <w:rPr>
+          <w:lang w:val="es-ES"/>
+        </w:rPr>
+        <w:t xml:space="preserve">Se diseñó la interfaz</w:t>
+      </w:r>
+      <w:r>
+        <w:rPr>
+          <w:lang w:val="es-ES"/>
+        </w:rPr>
+        <w:t xml:space="preserve"> </w:t>
+      </w:r>
+      <w:r>
+        <w:rPr>
+          <w:rStyle w:val="VerbatimChar"/>
+          <w:lang w:val="es-ES"/>
+        </w:rPr>
+        <w:t xml:space="preserve">Backend</w:t>
+      </w:r>
+      <w:r>
+        <w:rPr>
+          <w:lang w:val="es-ES"/>
+        </w:rPr>
+        <w:t xml:space="preserve"> </w:t>
+      </w:r>
+      <w:r>
+        <w:rPr>
+          <w:lang w:val="es-ES"/>
+        </w:rPr>
+        <w:t xml:space="preserve">con una implementación local completa que reproduce autenticación, sesiones y aislamiento, y con los adaptadores de Firebase como alternativa intercambiable. Fue la decisión de mayor retorno del proyecto: da privacidad, coste cero y uso sin conexión, y permitió ejecutar pruebas automáticas sin depender de ningún servicio externo.</w:t>
+      </w:r>
+    </w:p>
+    <w:p>
+      <w:pPr>
+        <w:pStyle w:val="Compact"/>
+        <w:numPr>
+          <w:ilvl w:val="0"/>
+          <w:numId w:val="1008"/>
+        </w:numPr>
+      </w:pPr>
+      <w:r>
+        <w:rPr>
+          <w:b/>
+          <w:bCs/>
+          <w:lang w:val="es-ES"/>
+        </w:rPr>
+        <w:t xml:space="preserve">Errores que solo aparecieron al ejecutar en un navegador real.</w:t>
+      </w:r>
+      <w:r>
+        <w:rPr>
+          <w:lang w:val="es-ES"/>
+        </w:rPr>
+        <w:t xml:space="preserve"> </w:t>
+      </w:r>
+      <w:r>
+        <w:rPr>
+          <w:lang w:val="es-ES"/>
+        </w:rPr>
+        <w:t xml:space="preserve">Recargar en</w:t>
+      </w:r>
+      <w:r>
+        <w:rPr>
+          <w:lang w:val="es-ES"/>
+        </w:rPr>
+        <w:t xml:space="preserve"> </w:t>
+      </w:r>
+      <w:r>
+        <w:rPr>
+          <w:rStyle w:val="VerbatimChar"/>
+          <w:lang w:val="es-ES"/>
+        </w:rPr>
+        <w:t xml:space="preserve">/p/…</w:t>
+      </w:r>
+      <w:r>
+        <w:rPr>
+          <w:lang w:val="es-ES"/>
+        </w:rPr>
+        <w:t xml:space="preserve"> </w:t>
+      </w:r>
+      <w:r>
+        <w:rPr>
+          <w:lang w:val="es-ES"/>
+        </w:rPr>
+        <w:t xml:space="preserve">redirigía al panel porque, durante un instante, había usuario pero los datos aún figuraban como «no cargando»: la página parecía no existir. Se corrigió derivando el estado de «cargando» del usuario para el que han llegado datos. El avatar quedaba medio tapado por el banner (falta de</w:t>
+      </w:r>
+      <w:r>
+        <w:rPr>
+          <w:lang w:val="es-ES"/>
+        </w:rPr>
+        <w:t xml:space="preserve"> </w:t>
+      </w:r>
+      <w:r>
+        <w:rPr>
+          <w:rStyle w:val="VerbatimChar"/>
+          <w:lang w:val="es-ES"/>
+        </w:rPr>
+        <w:t xml:space="preserve">z-index</w:t>
+      </w:r>
+      <w:r>
+        <w:rPr>
+          <w:lang w:val="es-ES"/>
+        </w:rPr>
+        <w:t xml:space="preserve">). Ambos pasaron las pruebas unitarias y solo los detectó la prueba de navegador.</w:t>
+      </w:r>
+    </w:p>
+    <w:p>
+      <w:pPr>
+        <w:pStyle w:val="Compact"/>
+        <w:numPr>
+          <w:ilvl w:val="0"/>
+          <w:numId w:val="1008"/>
+        </w:numPr>
+      </w:pPr>
+      <w:r>
+        <w:rPr>
+          <w:b/>
+          <w:bCs/>
+          <w:lang w:val="es-ES"/>
+        </w:rPr>
+        <w:t xml:space="preserve">Modelo de IA retirado.</w:t>
+      </w:r>
+      <w:r>
+        <w:rPr>
+          <w:lang w:val="es-ES"/>
+        </w:rPr>
+        <w:t xml:space="preserve"> </w:t>
+      </w:r>
+      <w:r>
+        <w:rPr>
+          <w:rStyle w:val="VerbatimChar"/>
+          <w:lang w:val="es-ES"/>
+        </w:rPr>
+        <w:t xml:space="preserve">gemini-2.5-flash</w:t>
+      </w:r>
+      <w:r>
+        <w:rPr>
+          <w:lang w:val="es-ES"/>
+        </w:rPr>
+        <w:t xml:space="preserve"> </w:t>
+      </w:r>
+      <w:r>
+        <w:rPr>
+          <w:lang w:val="es-ES"/>
+        </w:rPr>
+        <w:t xml:space="preserve">(el modelo pedido inicialmente) ya no admite cuentas nuevas (error 404). Se consultó la lista de modelos disponibles, se descubrió que</w:t>
+      </w:r>
+      <w:r>
+        <w:rPr>
+          <w:lang w:val="es-ES"/>
+        </w:rPr>
+        <w:t xml:space="preserve"> </w:t>
+      </w:r>
+      <w:r>
+        <w:rPr>
+          <w:rStyle w:val="VerbatimChar"/>
+          <w:lang w:val="es-ES"/>
+        </w:rPr>
+        <w:t xml:space="preserve">gemini-3.8-flash</w:t>
+      </w:r>
+      <w:r>
+        <w:rPr>
+          <w:lang w:val="es-ES"/>
+        </w:rPr>
+        <w:t xml:space="preserve"> </w:t>
+      </w:r>
+      <w:r>
+        <w:rPr>
+          <w:lang w:val="es-ES"/>
+        </w:rPr>
+        <w:t xml:space="preserve">no respondía (tiempo de espera) y se fijó</w:t>
+      </w:r>
+      <w:r>
+        <w:rPr>
+          <w:lang w:val="es-ES"/>
+        </w:rPr>
+        <w:t xml:space="preserve"> </w:t>
+      </w:r>
+      <w:r>
+        <w:rPr>
+          <w:rStyle w:val="VerbatimChar"/>
+          <w:lang w:val="es-ES"/>
+        </w:rPr>
+        <w:t xml:space="preserve">gemini-3.5-flash</w:t>
+      </w:r>
+      <w:r>
+        <w:rPr>
+          <w:lang w:val="es-ES"/>
+        </w:rPr>
+        <w:t xml:space="preserve"> </w:t>
+      </w:r>
+      <w:r>
+        <w:rPr>
+          <w:lang w:val="es-ES"/>
+        </w:rPr>
+        <w:t xml:space="preserve">(2 s), configurable. Además, Gemini devuelve errores 503/429 puntuales: se añadió reintento y, cuando la cuota se agotó durante las pruebas, el modo de respaldo funcionó como estaba diseñado.</w:t>
+      </w:r>
+    </w:p>
+    <w:p>
+      <w:pPr>
+        <w:pStyle w:val="Compact"/>
+        <w:numPr>
+          <w:ilvl w:val="0"/>
+          <w:numId w:val="1008"/>
+        </w:numPr>
+      </w:pPr>
+      <w:r>
+        <w:rPr>
+          <w:b/>
+          <w:bCs/>
+          <w:lang w:val="es-ES"/>
+        </w:rPr>
+        <w:t xml:space="preserve">Electron arrancaba como Node.</w:t>
+      </w:r>
+      <w:r>
+        <w:rPr>
+          <w:lang w:val="es-ES"/>
+        </w:rPr>
+        <w:t xml:space="preserve"> </w:t>
+      </w:r>
+      <w:r>
+        <w:rPr>
+          <w:lang w:val="es-ES"/>
+        </w:rPr>
+        <w:t xml:space="preserve">Un editor define</w:t>
+      </w:r>
+      <w:r>
+        <w:rPr>
+          <w:lang w:val="es-ES"/>
+        </w:rPr>
+        <w:t xml:space="preserve"> </w:t>
+      </w:r>
+      <w:r>
+        <w:rPr>
+          <w:rStyle w:val="VerbatimChar"/>
+          <w:lang w:val="es-ES"/>
+        </w:rPr>
+        <w:t xml:space="preserve">ELECTRON_RUN_AS_NODE=1</w:t>
+      </w:r>
+      <w:r>
+        <w:rPr>
+          <w:lang w:val="es-ES"/>
+        </w:rPr>
+        <w:t xml:space="preserve"> </w:t>
+      </w:r>
+      <w:r>
+        <w:rPr>
+          <w:lang w:val="es-ES"/>
+        </w:rPr>
+        <w:t xml:space="preserve">en sus terminales y Electron se comporta como Node (error «</w:t>
+      </w:r>
+      <w:r>
+        <w:rPr>
+          <w:rStyle w:val="VerbatimChar"/>
+          <w:lang w:val="es-ES"/>
+        </w:rPr>
+        <w:t xml:space="preserve">protocol</w:t>
+      </w:r>
+      <w:r>
+        <w:rPr>
+          <w:lang w:val="es-ES"/>
+        </w:rPr>
+        <w:t xml:space="preserve"> </w:t>
+      </w:r>
+      <w:r>
+        <w:rPr>
+          <w:lang w:val="es-ES"/>
+        </w:rPr>
+        <w:t xml:space="preserve">is undefined»). Se resolvió con un lanzador (</w:t>
+      </w:r>
+      <w:r>
+        <w:rPr>
+          <w:rStyle w:val="VerbatimChar"/>
+          <w:lang w:val="es-ES"/>
+        </w:rPr>
+        <w:t xml:space="preserve">scripts/lanzar-electron.mjs</w:t>
+      </w:r>
+      <w:r>
+        <w:rPr>
+          <w:lang w:val="es-ES"/>
+        </w:rPr>
+        <w:t xml:space="preserve">) que limpia la variable.</w:t>
+      </w:r>
+    </w:p>
+    <w:p>
+      <w:pPr>
+        <w:pStyle w:val="Compact"/>
+        <w:numPr>
+          <w:ilvl w:val="0"/>
+          <w:numId w:val="1008"/>
+        </w:numPr>
+      </w:pPr>
+      <w:r>
+        <w:rPr>
+          <w:b/>
+          <w:bCs/>
+          <w:lang w:val="es-ES"/>
+        </w:rPr>
+        <w:t xml:space="preserve">CSP y scripts en línea.</w:t>
+      </w:r>
+      <w:r>
+        <w:rPr>
+          <w:lang w:val="es-ES"/>
+        </w:rPr>
+        <w:t xml:space="preserve"> </w:t>
+      </w:r>
+      <w:r>
+        <w:rPr>
+          <w:lang w:val="es-ES"/>
+        </w:rPr>
+        <w:t xml:space="preserve">Para poder aplicar una política</w:t>
+      </w:r>
+      <w:r>
+        <w:rPr>
+          <w:lang w:val="es-ES"/>
+        </w:rPr>
+        <w:t xml:space="preserve"> </w:t>
+      </w:r>
+      <w:r>
+        <w:rPr>
+          <w:rStyle w:val="VerbatimChar"/>
+          <w:lang w:val="es-ES"/>
+        </w:rPr>
+        <w:t xml:space="preserve">script-src 'self'</w:t>
+      </w:r>
+      <w:r>
+        <w:rPr>
+          <w:lang w:val="es-ES"/>
+        </w:rPr>
+        <w:t xml:space="preserve"> </w:t>
+      </w:r>
+      <w:r>
+        <w:rPr>
+          <w:lang w:val="es-ES"/>
+        </w:rPr>
+        <w:t xml:space="preserve">se movió el script que aplica el tema a un archivo externo (</w:t>
+      </w:r>
+      <w:r>
+        <w:rPr>
+          <w:rStyle w:val="VerbatimChar"/>
+          <w:lang w:val="es-ES"/>
+        </w:rPr>
+        <w:t xml:space="preserve">theme-init.js</w:t>
+      </w:r>
+      <w:r>
+        <w:rPr>
+          <w:lang w:val="es-ES"/>
+        </w:rPr>
+        <w:t xml:space="preserve">).</w:t>
+      </w:r>
+    </w:p>
+    <w:p>
+      <w:pPr>
+        <w:pStyle w:val="Compact"/>
+        <w:numPr>
+          <w:ilvl w:val="0"/>
+          <w:numId w:val="1008"/>
+        </w:numPr>
+      </w:pPr>
+      <w:r>
+        <w:rPr>
+          <w:b/>
+          <w:bCs/>
+          <w:lang w:val="es-ES"/>
+        </w:rPr>
+        <w:t xml:space="preserve">Pruebas frágiles.</w:t>
+      </w:r>
+      <w:r>
+        <w:rPr>
+          <w:lang w:val="es-ES"/>
+        </w:rPr>
+        <w:t xml:space="preserve"> </w:t>
+      </w:r>
+      <w:r>
+        <w:rPr>
+          <w:lang w:val="es-ES"/>
+        </w:rPr>
+        <w:t xml:space="preserve">Varias fallaron por la herramienta y no por la aplicación (el protocolo</w:t>
+      </w:r>
+      <w:r>
+        <w:rPr>
+          <w:lang w:val="es-ES"/>
+        </w:rPr>
+        <w:t xml:space="preserve"> </w:t>
+      </w:r>
+      <w:r>
+        <w:rPr>
+          <w:rStyle w:val="VerbatimChar"/>
+          <w:lang w:val="es-ES"/>
+        </w:rPr>
+        <w:t xml:space="preserve">app://</w:t>
+      </w:r>
+      <w:r>
+        <w:rPr>
+          <w:lang w:val="es-ES"/>
+        </w:rPr>
+        <w:t xml:space="preserve"> </w:t>
+      </w:r>
+      <w:r>
+        <w:rPr>
+          <w:lang w:val="es-ES"/>
+        </w:rPr>
+        <w:t xml:space="preserve">no notifica «navegación terminada»;</w:t>
+      </w:r>
+      <w:r>
+        <w:rPr>
+          <w:lang w:val="es-ES"/>
+        </w:rPr>
+        <w:t xml:space="preserve"> </w:t>
+      </w:r>
+      <w:r>
+        <w:rPr>
+          <w:rStyle w:val="VerbatimChar"/>
+          <w:lang w:val="es-ES"/>
+        </w:rPr>
+        <w:t xml:space="preserve">page.evaluate</w:t>
+      </w:r>
+      <w:r>
+        <w:rPr>
+          <w:lang w:val="es-ES"/>
+        </w:rPr>
+        <w:t xml:space="preserve"> </w:t>
+      </w:r>
+      <w:r>
+        <w:rPr>
+          <w:lang w:val="es-ES"/>
+        </w:rPr>
+        <w:t xml:space="preserve">ejecuta</w:t>
+      </w:r>
+      <w:r>
+        <w:rPr>
+          <w:lang w:val="es-ES"/>
+        </w:rPr>
+        <w:t xml:space="preserve"> </w:t>
+      </w:r>
+      <w:r>
+        <w:rPr>
+          <w:rStyle w:val="VerbatimChar"/>
+          <w:lang w:val="es-ES"/>
+        </w:rPr>
+        <w:t xml:space="preserve">eval</w:t>
+      </w:r>
+      <w:r>
+        <w:rPr>
+          <w:lang w:val="es-ES"/>
+        </w:rPr>
+        <w:t xml:space="preserve"> </w:t>
+      </w:r>
+      <w:r>
+        <w:rPr>
+          <w:lang w:val="es-ES"/>
+        </w:rPr>
+        <w:t xml:space="preserve">por CDP; un texto transitorio «Pensando…» que con el respaldo dura milisegundos). Se diagnosticó cada una, se corrigió la prueba y se repitió hasta tener ejecuciones estables.</w:t>
+      </w:r>
+    </w:p>
+    <w:p>
+      <w:pPr>
+        <w:pStyle w:val="Compact"/>
+        <w:numPr>
+          <w:ilvl w:val="0"/>
+          <w:numId w:val="1008"/>
+        </w:numPr>
+      </w:pPr>
+      <w:r>
+        <w:rPr>
+          <w:b/>
+          <w:bCs/>
+          <w:lang w:val="es-ES"/>
+        </w:rPr>
+        <w:t xml:space="preserve">Tamaño del paquete.</w:t>
+      </w:r>
+      <w:r>
+        <w:rPr>
+          <w:lang w:val="es-ES"/>
+        </w:rPr>
+        <w:t xml:space="preserve"> </w:t>
+      </w:r>
+      <w:r>
+        <w:rPr>
+          <w:lang w:val="es-ES"/>
+        </w:rPr>
+        <w:t xml:space="preserve">El JavaScript ocupa 1,0 MB (268 KB comprimido), por encima del aviso de 500 KB de Vite. Es aceptable para una aplicación que se instala y usa sin conexión; la división por rutas (</w:t>
+      </w:r>
+      <w:r>
+        <w:rPr>
+          <w:i/>
+          <w:iCs/>
+          <w:lang w:val="es-ES"/>
+        </w:rPr>
+        <w:t xml:space="preserve">code splitting</w:t>
+      </w:r>
+      <w:r>
+        <w:rPr>
+          <w:lang w:val="es-ES"/>
+        </w:rPr>
+        <w:t xml:space="preserve">) queda como mejora.</w:t>
+      </w:r>
+    </w:p>
+    <w:p>
+      <w:r>
+        <w:pict>
+          <v:rect style="width:0;height:1.5pt" o:hralign="center" o:hrstd="t" o:hr="t"/>
+        </w:pict>
+      </w:r>
+    </w:p>
+    <w:p>
+      <w:pPr>
+        <w:pStyle w:val="Heading1"/>
+      </w:pPr>
+      <w:bookmarkStart w:id="68" w:name="_9fe372aa59c4bb0875237f6649bd884120daeaf"/>
+      <w:r>
+        <w:rPr>
+          <w:lang w:val="es-ES"/>
+        </w:rPr>
+        <w:t xml:space="preserve">12. Conclusiones, cumplimiento de objetivos y líneas futuras</w:t>
+      </w:r>
+      <w:bookmarkEnd w:id="68"/>
+    </w:p>
+    <w:p>
+      <w:pPr>
+        <w:pStyle w:val="Heading2"/>
+      </w:pPr>
+      <w:bookmarkStart w:id="69" w:name="_1992514e03816565542901f784711a971d33dd9"/>
+      <w:r>
+        <w:rPr>
+          <w:lang w:val="es-ES"/>
+        </w:rPr>
+        <w:t xml:space="preserve">12.1 Cumplimiento de objetivos</w:t>
+      </w:r>
+      <w:bookmarkEnd w:id="69"/>
+    </w:p>
+    <w:tbl>
+      <w:tblPr>
+        <w:tblStyle w:val="Table"/>
+        <w:tblW w:type="pct" w:w="5000"/>
+        <w:tblLayout w:type="fixed"/>
+        <w:tblLook w:firstRow="1" w:lastRow="0" w:firstColumn="0" w:lastColumn="0" w:noHBand="0" w:noVBand="0" w:val="0020"/>
+      </w:tblPr>
+      <w:tblGrid>
+        <w:gridCol w:w="681"/>
+        <w:gridCol w:w="2554"/>
+        <w:gridCol w:w="3065"/>
+        <w:gridCol w:w="1618"/>
+      </w:tblGrid>
+      <w:tr>
+        <w:trPr>
+          <w:tblHeader w:val="on"/>
+        </w:trPr>
+        <w:tc>
+          <w:tcPr/>
+          <w:p>
+            <w:pPr>
+              <w:pStyle w:val="Compact"/>
+            </w:pPr>
+            <w:r>
+              <w:rPr>
+                <w:lang w:val="es-ES"/>
+              </w:rPr>
+              <w:t xml:space="preserve">#</w:t>
+            </w:r>
+          </w:p>
+        </w:tc>
+        <w:tc>
+          <w:tcPr/>
+          <w:p>
+            <w:pPr>
+              <w:pStyle w:val="Compact"/>
+            </w:pPr>
+            <w:r>
+              <w:rPr>
+                <w:lang w:val="es-ES"/>
+              </w:rPr>
+              <w:t xml:space="preserve">Objetivo</w:t>
+            </w:r>
+          </w:p>
+        </w:tc>
+        <w:tc>
+          <w:tcPr/>
+          <w:p>
+            <w:pPr>
+              <w:pStyle w:val="Compact"/>
+            </w:pPr>
+            <w:r>
+              <w:rPr>
+                <w:lang w:val="es-ES"/>
+              </w:rPr>
+              <w:t xml:space="preserve">Estado</w:t>
+            </w:r>
+          </w:p>
+        </w:tc>
+        <w:tc>
+          <w:tcPr/>
+          <w:p>
+            <w:pPr>
+              <w:pStyle w:val="Compact"/>
+            </w:pPr>
+            <w:r>
+              <w:rPr>
+                <w:lang w:val="es-ES"/>
+              </w:rPr>
+              <w:t xml:space="preserve">Evidencia</w:t>
             </w:r>
           </w:p>
         </w:tc>
@@ -12969,21 +13345,21 @@
               <w:rPr>
                 <w:lang w:val="es-ES"/>
               </w:rPr>
-              <w:t xml:space="preserve">O7</w:t>
-            </w:r>
-          </w:p>
-        </w:tc>
-        <w:tc>
-          <w:tcPr/>
-          <w:p>
-            <w:pPr>
-              <w:pStyle w:val="Compact"/>
-            </w:pPr>
-            <w:r>
-              <w:rPr>
-                <w:lang w:val="es-ES"/>
-              </w:rPr>
-              <w:t xml:space="preserve">PWA instalable y sin conexión</w:t>
+              <w:t xml:space="preserve">O1</w:t>
+            </w:r>
+          </w:p>
+        </w:tc>
+        <w:tc>
+          <w:tcPr/>
+          <w:p>
+            <w:pPr>
+              <w:pStyle w:val="Compact"/>
+            </w:pPr>
+            <w:r>
+              <w:rPr>
+                <w:lang w:val="es-ES"/>
+              </w:rPr>
+              <w:t xml:space="preserve">Interfaz minimalista, responsive, sin scroll lateral</w:t>
             </w:r>
           </w:p>
         </w:tc>
@@ -13011,7 +13387,7 @@
               <w:rPr>
                 <w:lang w:val="es-ES"/>
               </w:rPr>
-              <w:t xml:space="preserve">E2E PWA (instalabilidad según Chrome)</w:t>
+              <w:t xml:space="preserve">E2E web a 1280 y 390 px</w:t>
             </w:r>
           </w:p>
         </w:tc>
@@ -13027,68 +13403,49 @@
               <w:rPr>
                 <w:lang w:val="es-ES"/>
               </w:rPr>
-              <w:t xml:space="preserve">O8</w:t>
-            </w:r>
-          </w:p>
-        </w:tc>
-        <w:tc>
-          <w:tcPr/>
-          <w:p>
-            <w:pPr>
-              <w:pStyle w:val="Compact"/>
-            </w:pPr>
-            <w:r>
-              <w:rPr>
-                <w:lang w:val="es-ES"/>
-              </w:rPr>
-              <w:t xml:space="preserve">Escritorio con Electron, seguro</w:t>
-            </w:r>
-          </w:p>
-        </w:tc>
-        <w:tc>
-          <w:tcPr/>
-          <w:p>
-            <w:pPr>
-              <w:pStyle w:val="Compact"/>
-            </w:pPr>
-            <w:r>
-              <w:rPr>
-                <w:lang w:val="es-ES"/>
-              </w:rPr>
-              <w:t xml:space="preserve">✅ Cumplido (</w:t>
-            </w:r>
-            <w:r>
-              <w:rPr>
-                <w:rStyle w:val="VerbatimChar"/>
-                <w:lang w:val="es-ES"/>
-              </w:rPr>
-              <w:t xml:space="preserve">.exe</w:t>
-            </w:r>
-            <w:r>
-              <w:rPr>
-                <w:lang w:val="es-ES"/>
-              </w:rPr>
-              <w:t xml:space="preserve"> </w:t>
-            </w:r>
-            <w:r>
-              <w:rPr>
-                <w:lang w:val="es-ES"/>
-              </w:rPr>
-              <w:t xml:space="preserve">verificado)</w:t>
-            </w:r>
-          </w:p>
-        </w:tc>
-        <w:tc>
-          <w:tcPr/>
-          <w:p>
-            <w:pPr>
-              <w:pStyle w:val="Compact"/>
-            </w:pPr>
-            <w:r>
-              <w:rPr>
-                <w:lang w:val="es-ES"/>
-              </w:rPr>
-              <w:t xml:space="preserve">E2E Electron</w:t>
+              <w:t xml:space="preserve">O2</w:t>
+            </w:r>
+          </w:p>
+        </w:tc>
+        <w:tc>
+          <w:tcPr/>
+          <w:p>
+            <w:pPr>
+              <w:pStyle w:val="Compact"/>
+            </w:pPr>
+            <w:r>
+              <w:rPr>
+                <w:lang w:val="es-ES"/>
+              </w:rPr>
+              <w:t xml:space="preserve">Autenticación y aislamiento por usuario</w:t>
+            </w:r>
+          </w:p>
+        </w:tc>
+        <w:tc>
+          <w:tcPr/>
+          <w:p>
+            <w:pPr>
+              <w:pStyle w:val="Compact"/>
+            </w:pPr>
+            <w:r>
+              <w:rPr>
+                <w:lang w:val="es-ES"/>
+              </w:rPr>
+              <w:t xml:space="preserve">✅ Cumplido en el modo Local-First; adaptador Firebase/Google implementado (despliegue cloud: línea futura)</w:t>
+            </w:r>
+          </w:p>
+        </w:tc>
+        <w:tc>
+          <w:tcPr/>
+          <w:p>
+            <w:pPr>
+              <w:pStyle w:val="Compact"/>
+            </w:pPr>
+            <w:r>
+              <w:rPr>
+                <w:lang w:val="es-ES"/>
+              </w:rPr>
+              <w:t xml:space="preserve">11 tests + E2E</w:t>
             </w:r>
           </w:p>
         </w:tc>
@@ -13104,50 +13461,49 @@
               <w:rPr>
                 <w:lang w:val="es-ES"/>
               </w:rPr>
-              <w:t xml:space="preserve">O9</w:t>
-            </w:r>
-          </w:p>
-        </w:tc>
-        <w:tc>
-          <w:tcPr/>
-          <w:p>
-            <w:pPr>
-              <w:pStyle w:val="Compact"/>
-            </w:pPr>
-            <w:r>
-              <w:rPr>
-                <w:lang w:val="es-ES"/>
-              </w:rPr>
-              <w:t xml:space="preserve">Estructura Capacitor</w:t>
-            </w:r>
-          </w:p>
-        </w:tc>
-        <w:tc>
-          <w:tcPr/>
-          <w:p>
-            <w:pPr>
-              <w:pStyle w:val="Compact"/>
-            </w:pPr>
-            <w:r>
-              <w:rPr>
-                <w:lang w:val="es-ES"/>
-              </w:rPr>
-              <w:t xml:space="preserve">🟡 Estructura lista y sincronizada (arquitectura extensible); la distribución móvil entregada es la PWA; el APK de tienda queda como línea futura</w:t>
-            </w:r>
-          </w:p>
-        </w:tc>
-        <w:tc>
-          <w:tcPr/>
-          <w:p>
-            <w:pPr>
-              <w:pStyle w:val="Compact"/>
-            </w:pPr>
-            <w:r>
-              <w:rPr>
-                <w:rStyle w:val="VerbatimChar"/>
-                <w:lang w:val="es-ES"/>
-              </w:rPr>
-              <w:t xml:space="preserve">android/</w:t>
+              <w:t xml:space="preserve">O3</w:t>
+            </w:r>
+          </w:p>
+        </w:tc>
+        <w:tc>
+          <w:tcPr/>
+          <w:p>
+            <w:pPr>
+              <w:pStyle w:val="Compact"/>
+            </w:pPr>
+            <w:r>
+              <w:rPr>
+                <w:lang w:val="es-ES"/>
+              </w:rPr>
+              <w:t xml:space="preserve">CRUD completo en tiempo real</w:t>
+            </w:r>
+          </w:p>
+        </w:tc>
+        <w:tc>
+          <w:tcPr/>
+          <w:p>
+            <w:pPr>
+              <w:pStyle w:val="Compact"/>
+            </w:pPr>
+            <w:r>
+              <w:rPr>
+                <w:lang w:val="es-ES"/>
+              </w:rPr>
+              <w:t xml:space="preserve">✅ Cumplido</w:t>
+            </w:r>
+          </w:p>
+        </w:tc>
+        <w:tc>
+          <w:tcPr/>
+          <w:p>
+            <w:pPr>
+              <w:pStyle w:val="Compact"/>
+            </w:pPr>
+            <w:r>
+              <w:rPr>
+                <w:lang w:val="es-ES"/>
+              </w:rPr>
+              <w:t xml:space="preserve">Tests + E2E</w:t>
             </w:r>
           </w:p>
         </w:tc>
@@ -13163,74 +13519,49 @@
               <w:rPr>
                 <w:lang w:val="es-ES"/>
               </w:rPr>
-              <w:t xml:space="preserve">O10</w:t>
-            </w:r>
-          </w:p>
-        </w:tc>
-        <w:tc>
-          <w:tcPr/>
-          <w:p>
-            <w:pPr>
-              <w:pStyle w:val="Compact"/>
-            </w:pPr>
-            <w:r>
-              <w:rPr>
-                <w:lang w:val="es-ES"/>
-              </w:rPr>
-              <w:t xml:space="preserve">Una sola base de código</w:t>
-            </w:r>
-          </w:p>
-        </w:tc>
-        <w:tc>
-          <w:tcPr/>
-          <w:p>
-            <w:pPr>
-              <w:pStyle w:val="Compact"/>
-            </w:pPr>
-            <w:r>
-              <w:rPr>
-                <w:lang w:val="es-ES"/>
-              </w:rPr>
-              <w:t xml:space="preserve">✅ Cumplido</w:t>
-            </w:r>
-          </w:p>
-        </w:tc>
-        <w:tc>
-          <w:tcPr/>
-          <w:p>
-            <w:pPr>
-              <w:pStyle w:val="Compact"/>
-            </w:pPr>
-            <w:r>
-              <w:rPr>
-                <w:lang w:val="es-ES"/>
-              </w:rPr>
-              <w:t xml:space="preserve">Misma</w:t>
-            </w:r>
-            <w:r>
-              <w:rPr>
-                <w:lang w:val="es-ES"/>
-              </w:rPr>
-              <w:t xml:space="preserve"> </w:t>
-            </w:r>
-            <w:r>
-              <w:rPr>
-                <w:rStyle w:val="VerbatimChar"/>
-                <w:lang w:val="es-ES"/>
-              </w:rPr>
-              <w:t xml:space="preserve">src/</w:t>
-            </w:r>
-            <w:r>
-              <w:rPr>
-                <w:lang w:val="es-ES"/>
-              </w:rPr>
-              <w:t xml:space="preserve"> </w:t>
-            </w:r>
-            <w:r>
-              <w:rPr>
-                <w:lang w:val="es-ES"/>
-              </w:rPr>
-              <w:t xml:space="preserve">en los cuatro canales</w:t>
+              <w:t xml:space="preserve">O4</w:t>
+            </w:r>
+          </w:p>
+        </w:tc>
+        <w:tc>
+          <w:tcPr/>
+          <w:p>
+            <w:pPr>
+              <w:pStyle w:val="Compact"/>
+            </w:pPr>
+            <w:r>
+              <w:rPr>
+                <w:lang w:val="es-ES"/>
+              </w:rPr>
+              <w:t xml:space="preserve">Diseño de datos, reglas y alternativa local</w:t>
+            </w:r>
+          </w:p>
+        </w:tc>
+        <w:tc>
+          <w:tcPr/>
+          <w:p>
+            <w:pPr>
+              <w:pStyle w:val="Compact"/>
+            </w:pPr>
+            <w:r>
+              <w:rPr>
+                <w:lang w:val="es-ES"/>
+              </w:rPr>
+              <w:t xml:space="preserve">✅ Cumplido (reglas de Firestore incluidas como arquitectura extensible)</w:t>
+            </w:r>
+          </w:p>
+        </w:tc>
+        <w:tc>
+          <w:tcPr/>
+          <w:p>
+            <w:pPr>
+              <w:pStyle w:val="Compact"/>
+            </w:pPr>
+            <w:r>
+              <w:rPr>
+                <w:lang w:val="es-ES"/>
+              </w:rPr>
+              <w:t xml:space="preserve">Sección 5</w:t>
             </w:r>
           </w:p>
         </w:tc>
@@ -13246,6 +13577,399 @@
               <w:rPr>
                 <w:lang w:val="es-ES"/>
               </w:rPr>
+              <w:t xml:space="preserve">O5</w:t>
+            </w:r>
+          </w:p>
+        </w:tc>
+        <w:tc>
+          <w:tcPr/>
+          <w:p>
+            <w:pPr>
+              <w:pStyle w:val="Compact"/>
+            </w:pPr>
+            <w:r>
+              <w:rPr>
+                <w:lang w:val="es-ES"/>
+              </w:rPr>
+              <w:t xml:space="preserve">API en PHP que oculte la clave</w:t>
+            </w:r>
+          </w:p>
+        </w:tc>
+        <w:tc>
+          <w:tcPr/>
+          <w:p>
+            <w:pPr>
+              <w:pStyle w:val="Compact"/>
+            </w:pPr>
+            <w:r>
+              <w:rPr>
+                <w:lang w:val="es-ES"/>
+              </w:rPr>
+              <w:t xml:space="preserve">✅ Cumplido</w:t>
+            </w:r>
+          </w:p>
+        </w:tc>
+        <w:tc>
+          <w:tcPr/>
+          <w:p>
+            <w:pPr>
+              <w:pStyle w:val="Compact"/>
+            </w:pPr>
+            <w:r>
+              <w:rPr>
+                <w:lang w:val="es-ES"/>
+              </w:rPr>
+              <w:t xml:space="preserve">11 peticiones + prueba real con Gemini</w:t>
+            </w:r>
+          </w:p>
+        </w:tc>
+      </w:tr>
+      <w:tr>
+        <w:tc>
+          <w:tcPr/>
+          <w:p>
+            <w:pPr>
+              <w:pStyle w:val="Compact"/>
+            </w:pPr>
+            <w:r>
+              <w:rPr>
+                <w:lang w:val="es-ES"/>
+              </w:rPr>
+              <w:t xml:space="preserve">O6</w:t>
+            </w:r>
+          </w:p>
+        </w:tc>
+        <w:tc>
+          <w:tcPr/>
+          <w:p>
+            <w:pPr>
+              <w:pStyle w:val="Compact"/>
+            </w:pPr>
+            <w:r>
+              <w:rPr>
+                <w:lang w:val="es-ES"/>
+              </w:rPr>
+              <w:t xml:space="preserve">Asistente con contexto y respaldo</w:t>
+            </w:r>
+          </w:p>
+        </w:tc>
+        <w:tc>
+          <w:tcPr/>
+          <w:p>
+            <w:pPr>
+              <w:pStyle w:val="Compact"/>
+            </w:pPr>
+            <w:r>
+              <w:rPr>
+                <w:lang w:val="es-ES"/>
+              </w:rPr>
+              <w:t xml:space="preserve">✅ Cumplido</w:t>
+            </w:r>
+          </w:p>
+        </w:tc>
+        <w:tc>
+          <w:tcPr/>
+          <w:p>
+            <w:pPr>
+              <w:pStyle w:val="Compact"/>
+            </w:pPr>
+            <w:r>
+              <w:rPr>
+                <w:lang w:val="es-ES"/>
+              </w:rPr>
+              <w:t xml:space="preserve">E2E + tests</w:t>
+            </w:r>
+          </w:p>
+        </w:tc>
+      </w:tr>
+      <w:tr>
+        <w:tc>
+          <w:tcPr/>
+          <w:p>
+            <w:pPr>
+              <w:pStyle w:val="Compact"/>
+            </w:pPr>
+            <w:r>
+              <w:rPr>
+                <w:lang w:val="es-ES"/>
+              </w:rPr>
+              <w:t xml:space="preserve">O7</w:t>
+            </w:r>
+          </w:p>
+        </w:tc>
+        <w:tc>
+          <w:tcPr/>
+          <w:p>
+            <w:pPr>
+              <w:pStyle w:val="Compact"/>
+            </w:pPr>
+            <w:r>
+              <w:rPr>
+                <w:lang w:val="es-ES"/>
+              </w:rPr>
+              <w:t xml:space="preserve">PWA instalable y sin conexión</w:t>
+            </w:r>
+          </w:p>
+        </w:tc>
+        <w:tc>
+          <w:tcPr/>
+          <w:p>
+            <w:pPr>
+              <w:pStyle w:val="Compact"/>
+            </w:pPr>
+            <w:r>
+              <w:rPr>
+                <w:lang w:val="es-ES"/>
+              </w:rPr>
+              <w:t xml:space="preserve">✅ Cumplido</w:t>
+            </w:r>
+          </w:p>
+        </w:tc>
+        <w:tc>
+          <w:tcPr/>
+          <w:p>
+            <w:pPr>
+              <w:pStyle w:val="Compact"/>
+            </w:pPr>
+            <w:r>
+              <w:rPr>
+                <w:lang w:val="es-ES"/>
+              </w:rPr>
+              <w:t xml:space="preserve">E2E PWA (instalabilidad según Chrome)</w:t>
+            </w:r>
+          </w:p>
+        </w:tc>
+      </w:tr>
+      <w:tr>
+        <w:tc>
+          <w:tcPr/>
+          <w:p>
+            <w:pPr>
+              <w:pStyle w:val="Compact"/>
+            </w:pPr>
+            <w:r>
+              <w:rPr>
+                <w:lang w:val="es-ES"/>
+              </w:rPr>
+              <w:t xml:space="preserve">O8</w:t>
+            </w:r>
+          </w:p>
+        </w:tc>
+        <w:tc>
+          <w:tcPr/>
+          <w:p>
+            <w:pPr>
+              <w:pStyle w:val="Compact"/>
+            </w:pPr>
+            <w:r>
+              <w:rPr>
+                <w:lang w:val="es-ES"/>
+              </w:rPr>
+              <w:t xml:space="preserve">Escritorio con Electron, seguro</w:t>
+            </w:r>
+          </w:p>
+        </w:tc>
+        <w:tc>
+          <w:tcPr/>
+          <w:p>
+            <w:pPr>
+              <w:pStyle w:val="Compact"/>
+            </w:pPr>
+            <w:r>
+              <w:rPr>
+                <w:lang w:val="es-ES"/>
+              </w:rPr>
+              <w:t xml:space="preserve">✅ Cumplido (</w:t>
+            </w:r>
+            <w:r>
+              <w:rPr>
+                <w:rStyle w:val="VerbatimChar"/>
+                <w:lang w:val="es-ES"/>
+              </w:rPr>
+              <w:t xml:space="preserve">.exe</w:t>
+            </w:r>
+            <w:r>
+              <w:rPr>
+                <w:lang w:val="es-ES"/>
+              </w:rPr>
+              <w:t xml:space="preserve"> </w:t>
+            </w:r>
+            <w:r>
+              <w:rPr>
+                <w:lang w:val="es-ES"/>
+              </w:rPr>
+              <w:t xml:space="preserve">verificado)</w:t>
+            </w:r>
+          </w:p>
+        </w:tc>
+        <w:tc>
+          <w:tcPr/>
+          <w:p>
+            <w:pPr>
+              <w:pStyle w:val="Compact"/>
+            </w:pPr>
+            <w:r>
+              <w:rPr>
+                <w:lang w:val="es-ES"/>
+              </w:rPr>
+              <w:t xml:space="preserve">E2E Electron</w:t>
+            </w:r>
+          </w:p>
+        </w:tc>
+      </w:tr>
+      <w:tr>
+        <w:tc>
+          <w:tcPr/>
+          <w:p>
+            <w:pPr>
+              <w:pStyle w:val="Compact"/>
+            </w:pPr>
+            <w:r>
+              <w:rPr>
+                <w:lang w:val="es-ES"/>
+              </w:rPr>
+              <w:t xml:space="preserve">O9</w:t>
+            </w:r>
+          </w:p>
+        </w:tc>
+        <w:tc>
+          <w:tcPr/>
+          <w:p>
+            <w:pPr>
+              <w:pStyle w:val="Compact"/>
+            </w:pPr>
+            <w:r>
+              <w:rPr>
+                <w:lang w:val="es-ES"/>
+              </w:rPr>
+              <w:t xml:space="preserve">Estructura Capacitor</w:t>
+            </w:r>
+          </w:p>
+        </w:tc>
+        <w:tc>
+          <w:tcPr/>
+          <w:p>
+            <w:pPr>
+              <w:pStyle w:val="Compact"/>
+            </w:pPr>
+            <w:r>
+              <w:rPr>
+                <w:lang w:val="es-ES"/>
+              </w:rPr>
+              <w:t xml:space="preserve">🟡 Estructura lista y sincronizada (arquitectura extensible); la distribución móvil entregada es la PWA; el APK de tienda queda como línea futura</w:t>
+            </w:r>
+          </w:p>
+        </w:tc>
+        <w:tc>
+          <w:tcPr/>
+          <w:p>
+            <w:pPr>
+              <w:pStyle w:val="Compact"/>
+            </w:pPr>
+            <w:r>
+              <w:rPr>
+                <w:rStyle w:val="VerbatimChar"/>
+                <w:lang w:val="es-ES"/>
+              </w:rPr>
+              <w:t xml:space="preserve">android/</w:t>
+            </w:r>
+          </w:p>
+        </w:tc>
+      </w:tr>
+      <w:tr>
+        <w:tc>
+          <w:tcPr/>
+          <w:p>
+            <w:pPr>
+              <w:pStyle w:val="Compact"/>
+            </w:pPr>
+            <w:r>
+              <w:rPr>
+                <w:lang w:val="es-ES"/>
+              </w:rPr>
+              <w:t xml:space="preserve">O10</w:t>
+            </w:r>
+          </w:p>
+        </w:tc>
+        <w:tc>
+          <w:tcPr/>
+          <w:p>
+            <w:pPr>
+              <w:pStyle w:val="Compact"/>
+            </w:pPr>
+            <w:r>
+              <w:rPr>
+                <w:lang w:val="es-ES"/>
+              </w:rPr>
+              <w:t xml:space="preserve">Una sola base de código</w:t>
+            </w:r>
+          </w:p>
+        </w:tc>
+        <w:tc>
+          <w:tcPr/>
+          <w:p>
+            <w:pPr>
+              <w:pStyle w:val="Compact"/>
+            </w:pPr>
+            <w:r>
+              <w:rPr>
+                <w:lang w:val="es-ES"/>
+              </w:rPr>
+              <w:t xml:space="preserve">✅ Cumplido</w:t>
+            </w:r>
+          </w:p>
+        </w:tc>
+        <w:tc>
+          <w:tcPr/>
+          <w:p>
+            <w:pPr>
+              <w:pStyle w:val="Compact"/>
+            </w:pPr>
+            <w:r>
+              <w:rPr>
+                <w:lang w:val="es-ES"/>
+              </w:rPr>
+              <w:t xml:space="preserve">Misma</w:t>
+            </w:r>
+            <w:r>
+              <w:rPr>
+                <w:lang w:val="es-ES"/>
+              </w:rPr>
+              <w:t xml:space="preserve"> </w:t>
+            </w:r>
+            <w:r>
+              <w:rPr>
+                <w:rStyle w:val="VerbatimChar"/>
+                <w:lang w:val="es-ES"/>
+              </w:rPr>
+              <w:t xml:space="preserve">src/</w:t>
+            </w:r>
+            <w:r>
+              <w:rPr>
+                <w:lang w:val="es-ES"/>
+              </w:rPr>
+              <w:t xml:space="preserve"> </w:t>
+            </w:r>
+            <w:r>
+              <w:rPr>
+                <w:lang w:val="es-ES"/>
+              </w:rPr>
+              <w:t xml:space="preserve">en los cuatro canales</w:t>
+            </w:r>
+          </w:p>
+        </w:tc>
+      </w:tr>
+      <w:tr>
+        <w:tc>
+          <w:tcPr/>
+          <w:p>
+            <w:pPr>
+              <w:pStyle w:val="Compact"/>
+            </w:pPr>
+            <w:r>
+              <w:rPr>
+                <w:lang w:val="es-ES"/>
+              </w:rPr>
               <w:t xml:space="preserve">O11</w:t>
             </w:r>
           </w:p>
@@ -13288,7 +14012,7 @@
               <w:rPr>
                 <w:lang w:val="es-ES"/>
               </w:rPr>
-              <w:t xml:space="preserve">85 comprobaciones</w:t>
+              <w:t xml:space="preserve">149 comprobaciones</w:t>
             </w:r>
           </w:p>
         </w:tc>
@@ -13298,14 +14022,14 @@
       <w:pPr>
         <w:pStyle w:val="Heading2"/>
       </w:pPr>
-      <w:bookmarkStart w:id="69" w:name="_conclusiones"/>
+      <w:bookmarkStart w:id="70" w:name="_conclusiones"/>
       <w:r>
         <w:rPr>
           <w:lang w:val="es-ES"/>
         </w:rPr>
         <w:t xml:space="preserve">12.2 Conclusiones</w:t>
       </w:r>
-      <w:bookmarkEnd w:id="69"/>
+      <w:bookmarkEnd w:id="70"/>
     </w:p>
     <w:p>
       <w:pPr>
@@ -13428,14 +14152,14 @@
       <w:pPr>
         <w:pStyle w:val="Heading2"/>
       </w:pPr>
-      <w:bookmarkStart w:id="70" w:name="_9091cdcc98cdab6711ee5411f84a97ab319096b"/>
+      <w:bookmarkStart w:id="71" w:name="_9091cdcc98cdab6711ee5411f84a97ab319096b"/>
       <w:r>
         <w:rPr>
           <w:lang w:val="es-ES"/>
         </w:rPr>
         <w:t xml:space="preserve">12.3 Líneas futuras</w:t>
       </w:r>
-      <w:bookmarkEnd w:id="70"/>
+      <w:bookmarkEnd w:id="71"/>
     </w:p>
     <w:p>
       <w:pPr>
@@ -13756,14 +14480,14 @@
       <w:pPr>
         <w:pStyle w:val="Heading1"/>
       </w:pPr>
-      <w:bookmarkStart w:id="71" w:name="_23d573e168ea0d2612a7e7c0bbc4ce28b4c8acc"/>
+      <w:bookmarkStart w:id="72" w:name="_23d573e168ea0d2612a7e7c0bbc4ce28b4c8acc"/>
       <w:r>
         <w:rPr>
           <w:lang w:val="es-ES"/>
         </w:rPr>
         <w:t xml:space="preserve">13. Bibliografía y referencias</w:t>
       </w:r>
-      <w:bookmarkEnd w:id="71"/>
+      <w:bookmarkEnd w:id="72"/>
     </w:p>
     <w:p>
       <w:pPr>
@@ -13799,7 +14523,7 @@
         </w:rPr>
         <w:t xml:space="preserve"> </w:t>
       </w:r>
-      <w:hyperlink r:id="rId72">
+      <w:hyperlink r:id="rId73">
         <w:r>
           <w:rPr>
             <w:rStyle w:val="Hyperlink"/>
@@ -13843,7 +14567,7 @@
         </w:rPr>
         <w:t xml:space="preserve"> </w:t>
       </w:r>
-      <w:hyperlink r:id="rId73">
+      <w:hyperlink r:id="rId74">
         <w:r>
           <w:rPr>
             <w:rStyle w:val="Hyperlink"/>
@@ -13887,7 +14611,7 @@
         </w:rPr>
         <w:t xml:space="preserve"> </w:t>
       </w:r>
-      <w:hyperlink r:id="rId74">
+      <w:hyperlink r:id="rId75">
         <w:r>
           <w:rPr>
             <w:rStyle w:val="Hyperlink"/>
@@ -13931,7 +14655,7 @@
         </w:rPr>
         <w:t xml:space="preserve"> </w:t>
       </w:r>
-      <w:hyperlink r:id="rId75">
+      <w:hyperlink r:id="rId76">
         <w:r>
           <w:rPr>
             <w:rStyle w:val="Hyperlink"/>
@@ -13975,7 +14699,7 @@
         </w:rPr>
         <w:t xml:space="preserve"> </w:t>
       </w:r>
-      <w:hyperlink r:id="rId76">
+      <w:hyperlink r:id="rId77">
         <w:r>
           <w:rPr>
             <w:rStyle w:val="Hyperlink"/>
@@ -14019,7 +14743,7 @@
         </w:rPr>
         <w:t xml:space="preserve"> </w:t>
       </w:r>
-      <w:hyperlink r:id="rId77">
+      <w:hyperlink r:id="rId78">
         <w:r>
           <w:rPr>
             <w:rStyle w:val="Hyperlink"/>
@@ -14063,7 +14787,7 @@
         </w:rPr>
         <w:t xml:space="preserve"> </w:t>
       </w:r>
-      <w:hyperlink r:id="rId78">
+      <w:hyperlink r:id="rId79">
         <w:r>
           <w:rPr>
             <w:rStyle w:val="Hyperlink"/>
@@ -14107,7 +14831,7 @@
         </w:rPr>
         <w:t xml:space="preserve"> </w:t>
       </w:r>
-      <w:hyperlink r:id="rId79">
+      <w:hyperlink r:id="rId80">
         <w:r>
           <w:rPr>
             <w:rStyle w:val="Hyperlink"/>
@@ -14151,7 +14875,7 @@
         </w:rPr>
         <w:t xml:space="preserve"> </w:t>
       </w:r>
-      <w:hyperlink r:id="rId80">
+      <w:hyperlink r:id="rId81">
         <w:r>
           <w:rPr>
             <w:rStyle w:val="Hyperlink"/>
@@ -14195,7 +14919,7 @@
         </w:rPr>
         <w:t xml:space="preserve"> </w:t>
       </w:r>
-      <w:hyperlink r:id="rId81">
+      <w:hyperlink r:id="rId82">
         <w:r>
           <w:rPr>
             <w:rStyle w:val="Hyperlink"/>
@@ -14239,7 +14963,7 @@
         </w:rPr>
         <w:t xml:space="preserve"> </w:t>
       </w:r>
-      <w:hyperlink r:id="rId82">
+      <w:hyperlink r:id="rId83">
         <w:r>
           <w:rPr>
             <w:rStyle w:val="Hyperlink"/>
@@ -14260,27 +14984,27 @@
       <w:pPr>
         <w:pStyle w:val="Heading1"/>
       </w:pPr>
-      <w:bookmarkStart w:id="83" w:name="_anexos"/>
+      <w:bookmarkStart w:id="84" w:name="_anexos"/>
       <w:r>
         <w:rPr>
           <w:lang w:val="es-ES"/>
         </w:rPr>
         <w:t xml:space="preserve">14. Anexos</w:t>
       </w:r>
-      <w:bookmarkEnd w:id="83"/>
+      <w:bookmarkEnd w:id="84"/>
     </w:p>
     <w:p>
       <w:pPr>
         <w:pStyle w:val="Heading2"/>
       </w:pPr>
-      <w:bookmarkStart w:id="84" w:name="_68d51fb8112b222f21eddd0eaaf0aaeceddeb09"/>
+      <w:bookmarkStart w:id="85" w:name="_68d51fb8112b222f21eddd0eaaf0aaeceddeb09"/>
       <w:r>
         <w:rPr>
           <w:lang w:val="es-ES"/>
         </w:rPr>
         <w:t xml:space="preserve">Anexo A — Estructura del repositorio</w:t>
       </w:r>
-      <w:bookmarkEnd w:id="84"/>
+      <w:bookmarkEnd w:id="85"/>
     </w:p>
     <w:p>
       <w:pPr>
@@ -14391,7 +15115,7 @@
           <w:rStyle w:val="VerbatimChar"/>
           <w:lang w:val="es-ES"/>
         </w:rPr>
-        <w:t xml:space="preserve">├── e2e/                  50 comprobaciones en navegador (web, PWA, Electron)</w:t>
+        <w:t xml:space="preserve">├── e2e/                  114 comprobaciones en navegador (web, auditoría QA, PWA, Electron)</w:t>
       </w:r>
       <w:r>
         <w:br/>
@@ -14428,14 +15152,14 @@
       <w:pPr>
         <w:pStyle w:val="Heading2"/>
       </w:pPr>
-      <w:bookmarkStart w:id="85" w:name="_157735442b62c9eae350b07c4e1d96615e0749f"/>
+      <w:bookmarkStart w:id="86" w:name="_157735442b62c9eae350b07c4e1d96615e0749f"/>
       <w:r>
         <w:rPr>
           <w:lang w:val="es-ES"/>
         </w:rPr>
         <w:t xml:space="preserve">Anexo B — Comandos principales</w:t>
       </w:r>
-      <w:bookmarkEnd w:id="85"/>
+      <w:bookmarkEnd w:id="86"/>
     </w:p>
     <w:tbl>
       <w:tblPr>
@@ -14854,14 +15578,14 @@
       <w:pPr>
         <w:pStyle w:val="Heading2"/>
       </w:pPr>
-      <w:bookmarkStart w:id="86" w:name="_e9c96f4f8fabefc5d1a18d414083d61922d2f29"/>
+      <w:bookmarkStart w:id="87" w:name="_e9c96f4f8fabefc5d1a18d414083d61922d2f29"/>
       <w:r>
         <w:rPr>
           <w:lang w:val="es-ES"/>
         </w:rPr>
         <w:t xml:space="preserve">Anexo C — Cuenta de demostración</w:t>
       </w:r>
-      <w:bookmarkEnd w:id="86"/>
+      <w:bookmarkEnd w:id="87"/>
     </w:p>
     <w:p>
       <w:pPr>

</xml_diff>

<commit_message>
Onboarding: panel de Primeros pasos y tour guiado interactivo (sin librerías), con pruebas, .exe y documentación
Co-Authored-By: Claude Sonnet 5.5 <noreply@anthropic.com>
</commit_message>
<xml_diff>
--- a/docs/MEMORIA_TFG.docx
+++ b/docs/MEMORIA_TFG.docx
@@ -518,7 +518,7 @@
           <w:bCs/>
           <w:lang w:val="es-ES"/>
         </w:rPr>
-        <w:t xml:space="preserve">35 pruebas unitarias y 114</w:t>
+        <w:t xml:space="preserve">49 pruebas unitarias y 138</w:t>
       </w:r>
       <w:r>
         <w:rPr>
@@ -546,7 +546,7 @@
         <w:rPr>
           <w:lang w:val="es-ES"/>
         </w:rPr>
-        <w:t xml:space="preserve">(Chrome y Electron; 149 en total), todas superadas.</w:t>
+        <w:t xml:space="preserve">(Chrome y Electron; 187 en total), todas superadas.</w:t>
       </w:r>
     </w:p>
     <w:p>
@@ -807,19 +807,19 @@
           <w:bCs/>
           <w:lang w:val="es-ES"/>
         </w:rPr>
-        <w:t xml:space="preserve">35 unit tests and 114 automated checks in real browsers</w:t>
-      </w:r>
-      <w:r>
-        <w:rPr>
-          <w:lang w:val="es-ES"/>
-        </w:rPr>
-        <w:t xml:space="preserve"> </w:t>
-      </w:r>
-      <w:r>
-        <w:rPr>
-          <w:lang w:val="es-ES"/>
-        </w:rPr>
-        <w:t xml:space="preserve">(Chrome and Electron; 149 in total), all</w:t>
+        <w:t xml:space="preserve">49 unit tests and 138 automated checks in real browsers</w:t>
+      </w:r>
+      <w:r>
+        <w:rPr>
+          <w:lang w:val="es-ES"/>
+        </w:rPr>
+        <w:t xml:space="preserve"> </w:t>
+      </w:r>
+      <w:r>
+        <w:rPr>
+          <w:lang w:val="es-ES"/>
+        </w:rPr>
+        <w:t xml:space="preserve">(Chrome and Electron; 187 in total), all</w:t>
       </w:r>
       <w:r>
         <w:rPr>
@@ -5792,7 +5792,7 @@
         <w:rPr>
           <w:lang w:val="es-ES"/>
         </w:rPr>
-        <w:t xml:space="preserve">Las pruebas automatizadas del entregable (35 unitarias y 114 en navegador real) validan el modo principal,</w:t>
+        <w:t xml:space="preserve">Las pruebas automatizadas del entregable (49 unitarias y 138 en navegador real) validan el modo principal,</w:t>
       </w:r>
       <w:r>
         <w:rPr>
@@ -7055,6 +7055,418 @@
           <w:bCs/>
           <w:lang w:val="es-ES"/>
         </w:rPr>
+        <w:t xml:space="preserve">Onboarding y tour interactivo.</w:t>
+      </w:r>
+      <w:r>
+        <w:rPr>
+          <w:lang w:val="es-ES"/>
+        </w:rPr>
+        <w:t xml:space="preserve"> </w:t>
+      </w:r>
+      <w:r>
+        <w:rPr>
+          <w:lang w:val="es-ES"/>
+        </w:rPr>
+        <w:t xml:space="preserve">Para guiar al usuario nuevo se añadió un sistema propio, sin librerías externas. (1) Un panel de</w:t>
+      </w:r>
+      <w:r>
+        <w:rPr>
+          <w:lang w:val="es-ES"/>
+        </w:rPr>
+        <w:t xml:space="preserve"> </w:t>
+      </w:r>
+      <w:r>
+        <w:rPr>
+          <w:b/>
+          <w:bCs/>
+          <w:lang w:val="es-ES"/>
+        </w:rPr>
+        <w:t xml:space="preserve">«Primeros pasos»</w:t>
+      </w:r>
+      <w:r>
+        <w:rPr>
+          <w:lang w:val="es-ES"/>
+        </w:rPr>
+        <w:t xml:space="preserve"> </w:t>
+      </w:r>
+      <w:r>
+        <w:rPr>
+          <w:lang w:val="es-ES"/>
+        </w:rPr>
+        <w:t xml:space="preserve">en el Dashboard con 7 pasos numerados —cada uno con su título, el motivo por el que importa y su estado</w:t>
+      </w:r>
+      <w:r>
+        <w:rPr>
+          <w:lang w:val="es-ES"/>
+        </w:rPr>
+        <w:t xml:space="preserve"> </w:t>
+      </w:r>
+      <w:r>
+        <w:rPr>
+          <w:rStyle w:val="VerbatimChar"/>
+          <w:lang w:val="es-ES"/>
+        </w:rPr>
+        <w:t xml:space="preserve">✓ Hecho</w:t>
+      </w:r>
+      <w:r>
+        <w:rPr>
+          <w:lang w:val="es-ES"/>
+        </w:rPr>
+        <w:t xml:space="preserve"> </w:t>
+      </w:r>
+      <w:r>
+        <w:rPr>
+          <w:lang w:val="es-ES"/>
+        </w:rPr>
+        <w:t xml:space="preserve">o un botón</w:t>
+      </w:r>
+      <w:r>
+        <w:rPr>
+          <w:lang w:val="es-ES"/>
+        </w:rPr>
+        <w:t xml:space="preserve"> </w:t>
+      </w:r>
+      <w:r>
+        <w:rPr>
+          <w:rStyle w:val="VerbatimChar"/>
+          <w:lang w:val="es-ES"/>
+        </w:rPr>
+        <w:t xml:space="preserve">Hacerlo</w:t>
+      </w:r>
+      <w:r>
+        <w:rPr>
+          <w:lang w:val="es-ES"/>
+        </w:rPr>
+        <w:t xml:space="preserve">—, una barra de progreso y un título dinámico («Primeros pasos:</w:t>
+      </w:r>
+      <w:r>
+        <w:rPr>
+          <w:lang w:val="es-ES"/>
+        </w:rPr>
+        <w:t xml:space="preserve"> </w:t>
+      </w:r>
+      <w:r>
+        <w:rPr>
+          <w:i/>
+          <w:iCs/>
+          <w:lang w:val="es-ES"/>
+        </w:rPr>
+        <w:t xml:space="preserve">X</w:t>
+      </w:r>
+      <w:r>
+        <w:rPr>
+          <w:lang w:val="es-ES"/>
+        </w:rPr>
+        <w:t xml:space="preserve"> </w:t>
+      </w:r>
+      <w:r>
+        <w:rPr>
+          <w:lang w:val="es-ES"/>
+        </w:rPr>
+        <w:t xml:space="preserve">pendientes para empezar», «¡Todo listo!» al llegar a 0). El progreso</w:t>
+      </w:r>
+      <w:r>
+        <w:rPr>
+          <w:lang w:val="es-ES"/>
+        </w:rPr>
+        <w:t xml:space="preserve"> </w:t>
+      </w:r>
+      <w:r>
+        <w:rPr>
+          <w:b/>
+          <w:bCs/>
+          <w:lang w:val="es-ES"/>
+        </w:rPr>
+        <w:t xml:space="preserve">no depende de botones de «marcar como hecho»</w:t>
+      </w:r>
+      <w:r>
+        <w:rPr>
+          <w:lang w:val="es-ES"/>
+        </w:rPr>
+        <w:t xml:space="preserve">: los pasos se completan cuando el usuario realiza la acción real (crear una página, editar la cita o las reglas, añadir un hábito, marcar una casilla, pulsar un día del calendario, preguntar al asistente, cambiar su foto) y se guardan en el perfil, en IndexedDB. El panel se puede</w:t>
+      </w:r>
+      <w:r>
+        <w:rPr>
+          <w:lang w:val="es-ES"/>
+        </w:rPr>
+        <w:t xml:space="preserve"> </w:t>
+      </w:r>
+      <w:r>
+        <w:rPr>
+          <w:b/>
+          <w:bCs/>
+          <w:lang w:val="es-ES"/>
+        </w:rPr>
+        <w:t xml:space="preserve">ocultar</w:t>
+      </w:r>
+      <w:r>
+        <w:rPr>
+          <w:lang w:val="es-ES"/>
+        </w:rPr>
+        <w:t xml:space="preserve"> </w:t>
+      </w:r>
+      <w:r>
+        <w:rPr>
+          <w:lang w:val="es-ES"/>
+        </w:rPr>
+        <w:t xml:space="preserve">(queda un botón discreto «Mostrar primeros pasos (</w:t>
+      </w:r>
+      <w:r>
+        <w:rPr>
+          <w:i/>
+          <w:iCs/>
+          <w:lang w:val="es-ES"/>
+        </w:rPr>
+        <w:t xml:space="preserve">X</w:t>
+      </w:r>
+      <w:r>
+        <w:rPr>
+          <w:lang w:val="es-ES"/>
+        </w:rPr>
+        <w:t xml:space="preserve">)», también disponible en Ajustes → Apariencia) y</w:t>
+      </w:r>
+      <w:r>
+        <w:rPr>
+          <w:lang w:val="es-ES"/>
+        </w:rPr>
+        <w:t xml:space="preserve"> </w:t>
+      </w:r>
+      <w:r>
+        <w:rPr>
+          <w:b/>
+          <w:bCs/>
+          <w:lang w:val="es-ES"/>
+        </w:rPr>
+        <w:t xml:space="preserve">reiniciar</w:t>
+      </w:r>
+      <w:r>
+        <w:rPr>
+          <w:lang w:val="es-ES"/>
+        </w:rPr>
+        <w:t xml:space="preserve">. (2) Un</w:t>
+      </w:r>
+      <w:r>
+        <w:rPr>
+          <w:lang w:val="es-ES"/>
+        </w:rPr>
+        <w:t xml:space="preserve"> </w:t>
+      </w:r>
+      <w:r>
+        <w:rPr>
+          <w:b/>
+          <w:bCs/>
+          <w:lang w:val="es-ES"/>
+        </w:rPr>
+        <w:t xml:space="preserve">tour guiado</w:t>
+      </w:r>
+      <w:r>
+        <w:rPr>
+          <w:lang w:val="es-ES"/>
+        </w:rPr>
+        <w:t xml:space="preserve"> </w:t>
+      </w:r>
+      <w:r>
+        <w:rPr>
+          <w:lang w:val="es-ES"/>
+        </w:rPr>
+        <w:t xml:space="preserve">(</w:t>
+      </w:r>
+      <w:r>
+        <w:rPr>
+          <w:rStyle w:val="VerbatimChar"/>
+          <w:lang w:val="es-ES"/>
+        </w:rPr>
+        <w:t xml:space="preserve">&lt;OnboardingTour /&gt;</w:t>
+      </w:r>
+      <w:r>
+        <w:rPr>
+          <w:lang w:val="es-ES"/>
+        </w:rPr>
+        <w:t xml:space="preserve">) con ventanitas flotantes: oscurece la pantalla, ilumina con un borde el elemento real al que apunta el paso (posición calculada con</w:t>
+      </w:r>
+      <w:r>
+        <w:rPr>
+          <w:lang w:val="es-ES"/>
+        </w:rPr>
+        <w:t xml:space="preserve"> </w:t>
+      </w:r>
+      <w:r>
+        <w:rPr>
+          <w:rStyle w:val="VerbatimChar"/>
+          <w:lang w:val="es-ES"/>
+        </w:rPr>
+        <w:t xml:space="preserve">getBoundingClientRect()</w:t>
+      </w:r>
+      <w:r>
+        <w:rPr>
+          <w:lang w:val="es-ES"/>
+        </w:rPr>
+        <w:t xml:space="preserve">, que se recalcula al redimensionar, hacer scroll o moverse el elemento), muestra «Paso</w:t>
+      </w:r>
+      <w:r>
+        <w:rPr>
+          <w:lang w:val="es-ES"/>
+        </w:rPr>
+        <w:t xml:space="preserve"> </w:t>
+      </w:r>
+      <w:r>
+        <w:rPr>
+          <w:i/>
+          <w:iCs/>
+          <w:lang w:val="es-ES"/>
+        </w:rPr>
+        <w:t xml:space="preserve">X</w:t>
+      </w:r>
+      <w:r>
+        <w:rPr>
+          <w:lang w:val="es-ES"/>
+        </w:rPr>
+        <w:t xml:space="preserve"> </w:t>
+      </w:r>
+      <w:r>
+        <w:rPr>
+          <w:lang w:val="es-ES"/>
+        </w:rPr>
+        <w:t xml:space="preserve">de 7» con puntos de progreso, y se controla con</w:t>
+      </w:r>
+      <w:r>
+        <w:rPr>
+          <w:lang w:val="es-ES"/>
+        </w:rPr>
+        <w:t xml:space="preserve"> </w:t>
+      </w:r>
+      <w:r>
+        <w:rPr>
+          <w:rStyle w:val="VerbatimChar"/>
+          <w:lang w:val="es-ES"/>
+        </w:rPr>
+        <w:t xml:space="preserve">Anterior</w:t>
+      </w:r>
+      <w:r>
+        <w:rPr>
+          <w:lang w:val="es-ES"/>
+        </w:rPr>
+        <w:t xml:space="preserve">,</w:t>
+      </w:r>
+      <w:r>
+        <w:rPr>
+          <w:lang w:val="es-ES"/>
+        </w:rPr>
+        <w:t xml:space="preserve"> </w:t>
+      </w:r>
+      <w:r>
+        <w:rPr>
+          <w:rStyle w:val="VerbatimChar"/>
+          <w:lang w:val="es-ES"/>
+        </w:rPr>
+        <w:t xml:space="preserve">Siguiente</w:t>
+      </w:r>
+      <w:r>
+        <w:rPr>
+          <w:lang w:val="es-ES"/>
+        </w:rPr>
+        <w:t xml:space="preserve">,</w:t>
+      </w:r>
+      <w:r>
+        <w:rPr>
+          <w:lang w:val="es-ES"/>
+        </w:rPr>
+        <w:t xml:space="preserve"> </w:t>
+      </w:r>
+      <w:r>
+        <w:rPr>
+          <w:rStyle w:val="VerbatimChar"/>
+          <w:lang w:val="es-ES"/>
+        </w:rPr>
+        <w:t xml:space="preserve">Finalizar</w:t>
+      </w:r>
+      <w:r>
+        <w:rPr>
+          <w:lang w:val="es-ES"/>
+        </w:rPr>
+        <w:t xml:space="preserve">,</w:t>
+      </w:r>
+      <w:r>
+        <w:rPr>
+          <w:lang w:val="es-ES"/>
+        </w:rPr>
+        <w:t xml:space="preserve"> </w:t>
+      </w:r>
+      <w:r>
+        <w:rPr>
+          <w:rStyle w:val="VerbatimChar"/>
+          <w:lang w:val="es-ES"/>
+        </w:rPr>
+        <w:t xml:space="preserve">Saltar tutorial</w:t>
+      </w:r>
+      <w:r>
+        <w:rPr>
+          <w:lang w:val="es-ES"/>
+        </w:rPr>
+        <w:t xml:space="preserve"> </w:t>
+      </w:r>
+      <w:r>
+        <w:rPr>
+          <w:lang w:val="es-ES"/>
+        </w:rPr>
+        <w:t xml:space="preserve">y el teclado (← → Esc). Navega solo entre pantallas (Dashboard, página de hábitos, calendario), abre y cierra el modal de Ajustes y el asistente cuando el paso lo necesita, y en móvil se comporta como una hoja inferior. Se lanza automáticamente</w:t>
+      </w:r>
+      <w:r>
+        <w:rPr>
+          <w:lang w:val="es-ES"/>
+        </w:rPr>
+        <w:t xml:space="preserve"> </w:t>
+      </w:r>
+      <w:r>
+        <w:rPr>
+          <w:b/>
+          <w:bCs/>
+          <w:lang w:val="es-ES"/>
+        </w:rPr>
+        <w:t xml:space="preserve">solo la primera vez que se registra una cuenta</w:t>
+      </w:r>
+      <w:r>
+        <w:rPr>
+          <w:lang w:val="es-ES"/>
+        </w:rPr>
+        <w:t xml:space="preserve">; después, desde el panel, la barra lateral («Ver tutorial de la app») o Ajustes; y el botón</w:t>
+      </w:r>
+      <w:r>
+        <w:rPr>
+          <w:lang w:val="es-ES"/>
+        </w:rPr>
+        <w:t xml:space="preserve"> </w:t>
+      </w:r>
+      <w:r>
+        <w:rPr>
+          <w:rStyle w:val="VerbatimChar"/>
+          <w:lang w:val="es-ES"/>
+        </w:rPr>
+        <w:t xml:space="preserve">Hacerlo</w:t>
+      </w:r>
+      <w:r>
+        <w:rPr>
+          <w:lang w:val="es-ES"/>
+        </w:rPr>
+        <w:t xml:space="preserve"> </w:t>
+      </w:r>
+      <w:r>
+        <w:rPr>
+          <w:lang w:val="es-ES"/>
+        </w:rPr>
+        <w:t xml:space="preserve">de cada paso abre el tour en ese paso. Las cuentas anteriores a esta función deducen los pasos que sus datos ya demuestran, y la cuenta demo arranca con pasos mezclados (hechos y pendientes) para poder enseñar el panel en la defensa.</w:t>
+      </w:r>
+    </w:p>
+    <w:p>
+      <w:pPr>
+        <w:pStyle w:val="BodyText"/>
+      </w:pPr>
+      <w:r>
+        <w:rPr>
+          <w:b/>
+          <w:bCs/>
+          <w:lang w:val="es-ES"/>
+        </w:rPr>
         <w:t xml:space="preserve">Fase 4 — Multiplataforma.</w:t>
       </w:r>
       <w:r>
@@ -10403,10 +10815,10 @@
         <w:tblLook w:firstRow="1" w:lastRow="0" w:firstColumn="0" w:lastColumn="0" w:noHBand="0" w:noVBand="0" w:val="0020"/>
       </w:tblPr>
       <w:tblGrid>
-        <w:gridCol w:w="2009"/>
-        <w:gridCol w:w="1773"/>
-        <w:gridCol w:w="1300"/>
-        <w:gridCol w:w="2837"/>
+        <w:gridCol w:w="2066"/>
+        <w:gridCol w:w="1721"/>
+        <w:gridCol w:w="1262"/>
+        <w:gridCol w:w="2869"/>
       </w:tblGrid>
       <w:tr>
         <w:trPr>
@@ -10643,7 +11055,7 @@
                 <w:bCs/>
                 <w:lang w:val="es-ES"/>
               </w:rPr>
-              <w:t xml:space="preserve">35</w:t>
+              <w:t xml:space="preserve">49</w:t>
             </w:r>
             <w:r>
               <w:rPr>
@@ -10655,7 +11067,7 @@
               <w:rPr>
                 <w:lang w:val="es-ES"/>
               </w:rPr>
-              <w:t xml:space="preserve">(2 archivos)</w:t>
+              <w:t xml:space="preserve">(3 archivos)</w:t>
             </w:r>
           </w:p>
         </w:tc>
@@ -10671,7 +11083,7 @@
                 <w:bCs/>
                 <w:lang w:val="es-ES"/>
               </w:rPr>
-              <w:t xml:space="preserve">35 superadas</w:t>
+              <w:t xml:space="preserve">49 superadas</w:t>
             </w:r>
           </w:p>
         </w:tc>
@@ -10877,7 +11289,7 @@
                 <w:bCs/>
                 <w:lang w:val="es-ES"/>
               </w:rPr>
-              <w:t xml:space="preserve">E2E PWA</w:t>
+              <w:t xml:space="preserve">E2E onboarding y tour</w:t>
             </w:r>
             <w:r>
               <w:rPr>
@@ -10903,7 +11315,7 @@
               <w:rPr>
                 <w:lang w:val="es-ES"/>
               </w:rPr>
-              <w:t xml:space="preserve">Playwright + CDP</w:t>
+              <w:t xml:space="preserve">Playwright</w:t>
             </w:r>
           </w:p>
         </w:tc>
@@ -10919,7 +11331,7 @@
                 <w:bCs/>
                 <w:lang w:val="es-ES"/>
               </w:rPr>
-              <w:t xml:space="preserve">11</w:t>
+              <w:t xml:space="preserve">23</w:t>
             </w:r>
             <w:r>
               <w:rPr>
@@ -10947,7 +11359,13 @@
                 <w:bCs/>
                 <w:lang w:val="es-ES"/>
               </w:rPr>
-              <w:t xml:space="preserve">11 superados</w:t>
+              <w:t xml:space="preserve">23 superados</w:t>
+            </w:r>
+            <w:r>
+              <w:rPr>
+                <w:lang w:val="es-ES"/>
+              </w:rPr>
+              <w:t xml:space="preserve">, 0 errores de consola</w:t>
             </w:r>
           </w:p>
         </w:tc>
@@ -10965,7 +11383,7 @@
                 <w:bCs/>
                 <w:lang w:val="es-ES"/>
               </w:rPr>
-              <w:t xml:space="preserve">E2E Electron</w:t>
+              <w:t xml:space="preserve">E2E PWA</w:t>
             </w:r>
             <w:r>
               <w:rPr>
@@ -10977,59 +11395,21 @@
               <w:rPr>
                 <w:lang w:val="es-ES"/>
               </w:rPr>
-              <w:t xml:space="preserve">(también el</w:t>
-            </w:r>
-            <w:r>
-              <w:rPr>
-                <w:lang w:val="es-ES"/>
-              </w:rPr>
-              <w:t xml:space="preserve"> </w:t>
-            </w:r>
-            <w:r>
-              <w:rPr>
-                <w:rStyle w:val="VerbatimChar"/>
-                <w:lang w:val="es-ES"/>
-              </w:rPr>
-              <w:t xml:space="preserve">.exe</w:t>
-            </w:r>
-            <w:r>
-              <w:rPr>
-                <w:lang w:val="es-ES"/>
-              </w:rPr>
-              <w:t xml:space="preserve"> </w:t>
-            </w:r>
-            <w:r>
-              <w:rPr>
-                <w:lang w:val="es-ES"/>
-              </w:rPr>
-              <w:t xml:space="preserve">empaquetado)</w:t>
-            </w:r>
-          </w:p>
-        </w:tc>
-        <w:tc>
-          <w:tcPr/>
-          <w:p>
-            <w:pPr>
-              <w:pStyle w:val="Compact"/>
-            </w:pPr>
-            <w:r>
-              <w:rPr>
-                <w:lang w:val="es-ES"/>
-              </w:rPr>
-              <w:t xml:space="preserve">Playwright</w:t>
-            </w:r>
-            <w:r>
-              <w:rPr>
-                <w:lang w:val="es-ES"/>
-              </w:rPr>
-              <w:t xml:space="preserve"> </w:t>
-            </w:r>
-            <w:r>
-              <w:rPr>
-                <w:rStyle w:val="VerbatimChar"/>
-                <w:lang w:val="es-ES"/>
-              </w:rPr>
-              <w:t xml:space="preserve">_electron</w:t>
+              <w:t xml:space="preserve">(Chrome)</w:t>
+            </w:r>
+          </w:p>
+        </w:tc>
+        <w:tc>
+          <w:tcPr/>
+          <w:p>
+            <w:pPr>
+              <w:pStyle w:val="Compact"/>
+            </w:pPr>
+            <w:r>
+              <w:rPr>
+                <w:lang w:val="es-ES"/>
+              </w:rPr>
+              <w:t xml:space="preserve">Playwright + CDP</w:t>
             </w:r>
           </w:p>
         </w:tc>
@@ -11045,7 +11425,7 @@
                 <w:bCs/>
                 <w:lang w:val="es-ES"/>
               </w:rPr>
-              <w:t xml:space="preserve">16</w:t>
+              <w:t xml:space="preserve">11</w:t>
             </w:r>
             <w:r>
               <w:rPr>
@@ -11073,7 +11453,7 @@
                 <w:bCs/>
                 <w:lang w:val="es-ES"/>
               </w:rPr>
-              <w:t xml:space="preserve">16 superados</w:t>
+              <w:t xml:space="preserve">11 superados</w:t>
             </w:r>
           </w:p>
         </w:tc>
@@ -11087,6 +11467,132 @@
             </w:pPr>
             <w:r>
               <w:rPr>
+                <w:b/>
+                <w:bCs/>
+                <w:lang w:val="es-ES"/>
+              </w:rPr>
+              <w:t xml:space="preserve">E2E Electron</w:t>
+            </w:r>
+            <w:r>
+              <w:rPr>
+                <w:lang w:val="es-ES"/>
+              </w:rPr>
+              <w:t xml:space="preserve"> </w:t>
+            </w:r>
+            <w:r>
+              <w:rPr>
+                <w:lang w:val="es-ES"/>
+              </w:rPr>
+              <w:t xml:space="preserve">(también el</w:t>
+            </w:r>
+            <w:r>
+              <w:rPr>
+                <w:lang w:val="es-ES"/>
+              </w:rPr>
+              <w:t xml:space="preserve"> </w:t>
+            </w:r>
+            <w:r>
+              <w:rPr>
+                <w:rStyle w:val="VerbatimChar"/>
+                <w:lang w:val="es-ES"/>
+              </w:rPr>
+              <w:t xml:space="preserve">.exe</w:t>
+            </w:r>
+            <w:r>
+              <w:rPr>
+                <w:lang w:val="es-ES"/>
+              </w:rPr>
+              <w:t xml:space="preserve"> </w:t>
+            </w:r>
+            <w:r>
+              <w:rPr>
+                <w:lang w:val="es-ES"/>
+              </w:rPr>
+              <w:t xml:space="preserve">empaquetado)</w:t>
+            </w:r>
+          </w:p>
+        </w:tc>
+        <w:tc>
+          <w:tcPr/>
+          <w:p>
+            <w:pPr>
+              <w:pStyle w:val="Compact"/>
+            </w:pPr>
+            <w:r>
+              <w:rPr>
+                <w:lang w:val="es-ES"/>
+              </w:rPr>
+              <w:t xml:space="preserve">Playwright</w:t>
+            </w:r>
+            <w:r>
+              <w:rPr>
+                <w:lang w:val="es-ES"/>
+              </w:rPr>
+              <w:t xml:space="preserve"> </w:t>
+            </w:r>
+            <w:r>
+              <w:rPr>
+                <w:rStyle w:val="VerbatimChar"/>
+                <w:lang w:val="es-ES"/>
+              </w:rPr>
+              <w:t xml:space="preserve">_electron</w:t>
+            </w:r>
+          </w:p>
+        </w:tc>
+        <w:tc>
+          <w:tcPr/>
+          <w:p>
+            <w:pPr>
+              <w:pStyle w:val="Compact"/>
+            </w:pPr>
+            <w:r>
+              <w:rPr>
+                <w:b/>
+                <w:bCs/>
+                <w:lang w:val="es-ES"/>
+              </w:rPr>
+              <w:t xml:space="preserve">17</w:t>
+            </w:r>
+            <w:r>
+              <w:rPr>
+                <w:lang w:val="es-ES"/>
+              </w:rPr>
+              <w:t xml:space="preserve"> </w:t>
+            </w:r>
+            <w:r>
+              <w:rPr>
+                <w:lang w:val="es-ES"/>
+              </w:rPr>
+              <w:t xml:space="preserve">pasos</w:t>
+            </w:r>
+          </w:p>
+        </w:tc>
+        <w:tc>
+          <w:tcPr/>
+          <w:p>
+            <w:pPr>
+              <w:pStyle w:val="Compact"/>
+            </w:pPr>
+            <w:r>
+              <w:rPr>
+                <w:b/>
+                <w:bCs/>
+                <w:lang w:val="es-ES"/>
+              </w:rPr>
+              <w:t xml:space="preserve">17 superados</w:t>
+            </w:r>
+          </w:p>
+        </w:tc>
+      </w:tr>
+      <w:tr>
+        <w:tc>
+          <w:tcPr/>
+          <w:p>
+            <w:pPr>
+              <w:pStyle w:val="Compact"/>
+            </w:pPr>
+            <w:r>
+              <w:rPr>
                 <w:lang w:val="es-ES"/>
               </w:rPr>
               <w:t xml:space="preserve">Proxy PHP</w:t>
@@ -11154,12 +11660,12 @@
       <w:pPr>
         <w:pStyle w:val="Heading2"/>
       </w:pPr>
-      <w:bookmarkStart w:id="63" w:name="_03e773c71d080de26d725913df1e1d56ec97f85"/>
-      <w:r>
-        <w:rPr>
-          <w:lang w:val="es-ES"/>
-        </w:rPr>
-        <w:t xml:space="preserve">10.1 Pruebas unitarias (35)</w:t>
+      <w:bookmarkStart w:id="63" w:name="_30400229c5933d8812d8cf75dc1b9c7d8a97401"/>
+      <w:r>
+        <w:rPr>
+          <w:lang w:val="es-ES"/>
+        </w:rPr>
+        <w:t xml:space="preserve">10.1 Pruebas unitarias (49)</w:t>
       </w:r>
       <w:bookmarkEnd w:id="63"/>
     </w:p>
@@ -11351,24 +11857,28 @@
           <w:bCs/>
           <w:lang w:val="es-ES"/>
         </w:rPr>
-        <w:t xml:space="preserve">Asistente y estadísticas (15):</w:t>
-      </w:r>
-      <w:r>
-        <w:rPr>
-          <w:lang w:val="es-ES"/>
-        </w:rPr>
-        <w:t xml:space="preserve"> </w:t>
-      </w:r>
-      <w:r>
-        <w:rPr>
-          <w:lang w:val="es-ES"/>
-        </w:rPr>
-        <w:t xml:space="preserve">cálculo de rachas y porcentajes; el contexto respeta su límite; validación de páginas propuestas por la IA (tipos, longitudes, cantidades, JSON roto); modo de respaldo (intenciones, plantillas, sin páginas).</w:t>
-      </w:r>
-    </w:p>
-    <w:p>
-      <w:pPr>
-        <w:pStyle w:val="FirstParagraph"/>
+        <w:t xml:space="preserve">Onboarding (14):</w:t>
+      </w:r>
+      <w:r>
+        <w:rPr>
+          <w:lang w:val="es-ES"/>
+        </w:rPr>
+        <w:t xml:space="preserve"> </w:t>
+      </w:r>
+      <w:r>
+        <w:rPr>
+          <w:lang w:val="es-ES"/>
+        </w:rPr>
+        <w:t xml:space="preserve">los 7 pasos están completos y son únicos; recuento de pendientes; deducción de pasos para cuentas antiguas; una cuenta nueva empieza con el tour sin ver; la demo arranca con pasos mezclados; el progreso, el ocultar y el reiniciar sobreviven a una nueva instancia; se rechazan estados con forma inválida; un usuario no puede tocar el onboarding de otro; y el cálculo de posición de la ventanita nunca la saca de la pantalla (barrido de 4 resoluciones y decenas de posiciones del elemento).</w:t>
+      </w:r>
+    </w:p>
+    <w:p>
+      <w:pPr>
+        <w:pStyle w:val="Compact"/>
+        <w:numPr>
+          <w:ilvl w:val="0"/>
+          <w:numId w:val="1007"/>
+        </w:numPr>
       </w:pPr>
       <w:r>
         <w:rPr>
@@ -11376,32 +11886,57 @@
           <w:bCs/>
           <w:lang w:val="es-ES"/>
         </w:rPr>
-        <w:t xml:space="preserve">Pruebas de mutación.</w:t>
-      </w:r>
-      <w:r>
-        <w:rPr>
-          <w:lang w:val="es-ES"/>
-        </w:rPr>
-        <w:t xml:space="preserve"> </w:t>
-      </w:r>
-      <w:r>
-        <w:rPr>
-          <w:lang w:val="es-ES"/>
-        </w:rPr>
-        <w:t xml:space="preserve">Para comprobar que los tests detectan fallos reales, se desactivó a propósito el bloqueo por intentos y la comprobación de propietario:</w:t>
-      </w:r>
-      <w:r>
-        <w:rPr>
-          <w:lang w:val="es-ES"/>
-        </w:rPr>
-        <w:t xml:space="preserve"> </w:t>
-      </w:r>
+        <w:t xml:space="preserve">Asistente y estadísticas (15):</w:t>
+      </w:r>
+      <w:r>
+        <w:rPr>
+          <w:lang w:val="es-ES"/>
+        </w:rPr>
+        <w:t xml:space="preserve"> </w:t>
+      </w:r>
+      <w:r>
+        <w:rPr>
+          <w:lang w:val="es-ES"/>
+        </w:rPr>
+        <w:t xml:space="preserve">cálculo de rachas y porcentajes; el contexto respeta su límite; validación de páginas propuestas por la IA (tipos, longitudes, cantidades, JSON roto); modo de respaldo (intenciones, plantillas, sin páginas).</w:t>
+      </w:r>
+    </w:p>
+    <w:p>
+      <w:pPr>
+        <w:pStyle w:val="FirstParagraph"/>
+      </w:pPr>
       <w:r>
         <w:rPr>
           <w:b/>
           <w:bCs/>
           <w:lang w:val="es-ES"/>
         </w:rPr>
+        <w:t xml:space="preserve">Pruebas de mutación.</w:t>
+      </w:r>
+      <w:r>
+        <w:rPr>
+          <w:lang w:val="es-ES"/>
+        </w:rPr>
+        <w:t xml:space="preserve"> </w:t>
+      </w:r>
+      <w:r>
+        <w:rPr>
+          <w:lang w:val="es-ES"/>
+        </w:rPr>
+        <w:t xml:space="preserve">Para comprobar que los tests detectan fallos reales, se desactivó a propósito el bloqueo por intentos y la comprobación de propietario:</w:t>
+      </w:r>
+      <w:r>
+        <w:rPr>
+          <w:lang w:val="es-ES"/>
+        </w:rPr>
+        <w:t xml:space="preserve"> </w:t>
+      </w:r>
+      <w:r>
+        <w:rPr>
+          <w:b/>
+          <w:bCs/>
+          <w:lang w:val="es-ES"/>
+        </w:rPr>
         <w:t xml:space="preserve">3 tests fallaron</w:t>
       </w:r>
       <w:r>
@@ -11421,12 +11956,12 @@
       <w:pPr>
         <w:pStyle w:val="Heading2"/>
       </w:pPr>
-      <w:bookmarkStart w:id="64" w:name="_e79bea4939f96994b16ecf1824b2c5924460a10"/>
-      <w:r>
-        <w:rPr>
-          <w:lang w:val="es-ES"/>
-        </w:rPr>
-        <w:t xml:space="preserve">10.2 Pruebas en navegador real (114)</w:t>
+      <w:bookmarkStart w:id="64" w:name="_fe54ca01ac6e7427a1d908023b37864ff0734ca"/>
+      <w:r>
+        <w:rPr>
+          <w:lang w:val="es-ES"/>
+        </w:rPr>
+        <w:t xml:space="preserve">10.2 Pruebas en navegador real (138)</w:t>
       </w:r>
       <w:bookmarkEnd w:id="64"/>
     </w:p>
@@ -12178,45 +12713,33 @@
         <w:rPr>
           <w:lang w:val="es-ES"/>
         </w:rPr>
-        <w:t xml:space="preserve">Además se descartaron falsos positivos propios de la prueba (por ejemplo, selectores que coincidían con la cabecera de la aplicación y no con la de la página); no se cuentan como defectos de la aplicación.</w:t>
-      </w:r>
-    </w:p>
-    <w:p>
-      <w:pPr>
-        <w:pStyle w:val="BodyText"/>
-      </w:pPr>
+        <w:t xml:space="preserve">Las pruebas del onboarding encontraron otros dos defectos mientras se desarrollaba la función, ya corregidos: (a) la tecla</w:t>
+      </w:r>
+      <w:r>
+        <w:rPr>
+          <w:lang w:val="es-ES"/>
+        </w:rPr>
+        <w:t xml:space="preserve"> </w:t>
+      </w:r>
       <w:r>
         <w:rPr>
           <w:b/>
           <w:bCs/>
           <w:lang w:val="es-ES"/>
         </w:rPr>
-        <w:t xml:space="preserve">PWA, 11 pasos</w:t>
-      </w:r>
-      <w:r>
-        <w:rPr>
-          <w:lang w:val="es-ES"/>
-        </w:rPr>
-        <w:t xml:space="preserve"> </w:t>
-      </w:r>
-      <w:r>
-        <w:rPr>
-          <w:lang w:val="es-ES"/>
-        </w:rPr>
-        <w:t xml:space="preserve">(</w:t>
-      </w:r>
-      <w:r>
-        <w:rPr>
-          <w:rStyle w:val="VerbatimChar"/>
-          <w:lang w:val="es-ES"/>
-        </w:rPr>
-        <w:t xml:space="preserve">e2e/pwa.mjs</w:t>
-      </w:r>
-      <w:r>
-        <w:rPr>
-          <w:lang w:val="es-ES"/>
-        </w:rPr>
-        <w:t xml:space="preserve">): manifest e iconos válidos;</w:t>
+        <w:t xml:space="preserve">Esc se perdía</w:t>
+      </w:r>
+      <w:r>
+        <w:rPr>
+          <w:lang w:val="es-ES"/>
+        </w:rPr>
+        <w:t xml:space="preserve"> </w:t>
+      </w:r>
+      <w:r>
+        <w:rPr>
+          <w:lang w:val="es-ES"/>
+        </w:rPr>
+        <w:t xml:space="preserve">si había un modal abierto, porque al volver a registrarse el oyente del tour en mitad del mismo evento dejaba de recibirlo (solución: un único oyente en fase de captura que lee siempre las últimas funciones desde una referencia); y (b) el tour</w:t>
       </w:r>
       <w:r>
         <w:rPr>
@@ -12230,6 +12753,295 @@
           <w:bCs/>
           <w:lang w:val="es-ES"/>
         </w:rPr>
+        <w:t xml:space="preserve">reaparecía al recargar</w:t>
+      </w:r>
+      <w:r>
+        <w:rPr>
+          <w:lang w:val="es-ES"/>
+        </w:rPr>
+        <w:t xml:space="preserve"> </w:t>
+      </w:r>
+      <w:r>
+        <w:rPr>
+          <w:lang w:val="es-ES"/>
+        </w:rPr>
+        <w:t xml:space="preserve">si se recargaba justo después de cerrarlo, porque «visto» se guardaba al cerrar (solución: guardarlo al lanzarlo).</w:t>
+      </w:r>
+    </w:p>
+    <w:p>
+      <w:pPr>
+        <w:pStyle w:val="BodyText"/>
+      </w:pPr>
+      <w:r>
+        <w:rPr>
+          <w:lang w:val="es-ES"/>
+        </w:rPr>
+        <w:t xml:space="preserve">Además se descartaron falsos positivos propios de la prueba (por ejemplo, selectores que coincidían con la cabecera de la aplicación y no con la de la página); no se cuentan como defectos de la aplicación.</w:t>
+      </w:r>
+    </w:p>
+    <w:p>
+      <w:pPr>
+        <w:pStyle w:val="BodyText"/>
+      </w:pPr>
+      <w:r>
+        <w:rPr>
+          <w:b/>
+          <w:bCs/>
+          <w:lang w:val="es-ES"/>
+        </w:rPr>
+        <w:t xml:space="preserve">Onboarding y tour, 23 pasos</w:t>
+      </w:r>
+      <w:r>
+        <w:rPr>
+          <w:lang w:val="es-ES"/>
+        </w:rPr>
+        <w:t xml:space="preserve"> </w:t>
+      </w:r>
+      <w:r>
+        <w:rPr>
+          <w:lang w:val="es-ES"/>
+        </w:rPr>
+        <w:t xml:space="preserve">(</w:t>
+      </w:r>
+      <w:r>
+        <w:rPr>
+          <w:rStyle w:val="VerbatimChar"/>
+          <w:lang w:val="es-ES"/>
+        </w:rPr>
+        <w:t xml:space="preserve">e2e/onboarding.mjs</w:t>
+      </w:r>
+      <w:r>
+        <w:rPr>
+          <w:lang w:val="es-ES"/>
+        </w:rPr>
+        <w:t xml:space="preserve">): el tour se lanza solo al registrarse y no reaparece tras recargar; el panel muestra «Primeros pasos: 7 pendientes para empezar»; cada</w:t>
+      </w:r>
+      <w:r>
+        <w:rPr>
+          <w:lang w:val="es-ES"/>
+        </w:rPr>
+        <w:t xml:space="preserve"> </w:t>
+      </w:r>
+      <w:r>
+        <w:rPr>
+          <w:rStyle w:val="VerbatimChar"/>
+          <w:lang w:val="es-ES"/>
+        </w:rPr>
+        <w:t xml:space="preserve">Hacerlo</w:t>
+      </w:r>
+      <w:r>
+        <w:rPr>
+          <w:lang w:val="es-ES"/>
+        </w:rPr>
+        <w:t xml:space="preserve"> </w:t>
+      </w:r>
+      <w:r>
+        <w:rPr>
+          <w:lang w:val="es-ES"/>
+        </w:rPr>
+        <w:t xml:space="preserve">(los 7) lleva al elemento correcto, lo ilumina con el foco y, al realizar la acción, el paso pasa a</w:t>
+      </w:r>
+      <w:r>
+        <w:rPr>
+          <w:lang w:val="es-ES"/>
+        </w:rPr>
+        <w:t xml:space="preserve"> </w:t>
+      </w:r>
+      <w:r>
+        <w:rPr>
+          <w:rStyle w:val="VerbatimChar"/>
+          <w:lang w:val="es-ES"/>
+        </w:rPr>
+        <w:t xml:space="preserve">✓ Hecho</w:t>
+      </w:r>
+      <w:r>
+        <w:rPr>
+          <w:lang w:val="es-ES"/>
+        </w:rPr>
+        <w:t xml:space="preserve">; llegar a «¡Todo listo!»; persistencia tras recargar;</w:t>
+      </w:r>
+      <w:r>
+        <w:rPr>
+          <w:lang w:val="es-ES"/>
+        </w:rPr>
+        <w:t xml:space="preserve"> </w:t>
+      </w:r>
+      <w:r>
+        <w:rPr>
+          <w:rStyle w:val="VerbatimChar"/>
+          <w:lang w:val="es-ES"/>
+        </w:rPr>
+        <w:t xml:space="preserve">Reiniciar pasos</w:t>
+      </w:r>
+      <w:r>
+        <w:rPr>
+          <w:lang w:val="es-ES"/>
+        </w:rPr>
+        <w:t xml:space="preserve">;</w:t>
+      </w:r>
+      <w:r>
+        <w:rPr>
+          <w:lang w:val="es-ES"/>
+        </w:rPr>
+        <w:t xml:space="preserve"> </w:t>
+      </w:r>
+      <w:r>
+        <w:rPr>
+          <w:rStyle w:val="VerbatimChar"/>
+          <w:lang w:val="es-ES"/>
+        </w:rPr>
+        <w:t xml:space="preserve">Ocultar</w:t>
+      </w:r>
+      <w:r>
+        <w:rPr>
+          <w:lang w:val="es-ES"/>
+        </w:rPr>
+        <w:t xml:space="preserve"> </w:t>
+      </w:r>
+      <w:r>
+        <w:rPr>
+          <w:lang w:val="es-ES"/>
+        </w:rPr>
+        <w:t xml:space="preserve">y volver a mostrar (persistente); contraer y expandir; recorrido completo con</w:t>
+      </w:r>
+      <w:r>
+        <w:rPr>
+          <w:lang w:val="es-ES"/>
+        </w:rPr>
+        <w:t xml:space="preserve"> </w:t>
+      </w:r>
+      <w:r>
+        <w:rPr>
+          <w:rStyle w:val="VerbatimChar"/>
+          <w:lang w:val="es-ES"/>
+        </w:rPr>
+        <w:t xml:space="preserve">Siguiente</w:t>
+      </w:r>
+      <w:r>
+        <w:rPr>
+          <w:lang w:val="es-ES"/>
+        </w:rPr>
+        <w:t xml:space="preserve"> </w:t>
+      </w:r>
+      <w:r>
+        <w:rPr>
+          <w:lang w:val="es-ES"/>
+        </w:rPr>
+        <w:t xml:space="preserve">por los 7 pasos cambiando de pantalla;</w:t>
+      </w:r>
+      <w:r>
+        <w:rPr>
+          <w:lang w:val="es-ES"/>
+        </w:rPr>
+        <w:t xml:space="preserve"> </w:t>
+      </w:r>
+      <w:r>
+        <w:rPr>
+          <w:rStyle w:val="VerbatimChar"/>
+          <w:lang w:val="es-ES"/>
+        </w:rPr>
+        <w:t xml:space="preserve">Anterior</w:t>
+      </w:r>
+      <w:r>
+        <w:rPr>
+          <w:lang w:val="es-ES"/>
+        </w:rPr>
+        <w:t xml:space="preserve">; teclado (← → Esc);</w:t>
+      </w:r>
+      <w:r>
+        <w:rPr>
+          <w:lang w:val="es-ES"/>
+        </w:rPr>
+        <w:t xml:space="preserve"> </w:t>
+      </w:r>
+      <w:r>
+        <w:rPr>
+          <w:rStyle w:val="VerbatimChar"/>
+          <w:lang w:val="es-ES"/>
+        </w:rPr>
+        <w:t xml:space="preserve">Saltar tutorial</w:t>
+      </w:r>
+      <w:r>
+        <w:rPr>
+          <w:lang w:val="es-ES"/>
+        </w:rPr>
+        <w:t xml:space="preserve"> </w:t>
+      </w:r>
+      <w:r>
+        <w:rPr>
+          <w:lang w:val="es-ES"/>
+        </w:rPr>
+        <w:t xml:space="preserve">y</w:t>
+      </w:r>
+      <w:r>
+        <w:rPr>
+          <w:lang w:val="es-ES"/>
+        </w:rPr>
+        <w:t xml:space="preserve"> </w:t>
+      </w:r>
+      <w:r>
+        <w:rPr>
+          <w:rStyle w:val="VerbatimChar"/>
+          <w:lang w:val="es-ES"/>
+        </w:rPr>
+        <w:t xml:space="preserve">Finalizar</w:t>
+      </w:r>
+      <w:r>
+        <w:rPr>
+          <w:lang w:val="es-ES"/>
+        </w:rPr>
+        <w:t xml:space="preserve">; lanzarlo desde la barra lateral y desde Ajustes; en móvil (390 px) la ventanita cabe en pantalla en los 7 pasos y no hay scroll lateral; la cuenta demo muestra estados mezclados; y consola limpia.</w:t>
+      </w:r>
+    </w:p>
+    <w:p>
+      <w:pPr>
+        <w:pStyle w:val="BodyText"/>
+      </w:pPr>
+      <w:r>
+        <w:rPr>
+          <w:b/>
+          <w:bCs/>
+          <w:lang w:val="es-ES"/>
+        </w:rPr>
+        <w:t xml:space="preserve">PWA, 11 pasos</w:t>
+      </w:r>
+      <w:r>
+        <w:rPr>
+          <w:lang w:val="es-ES"/>
+        </w:rPr>
+        <w:t xml:space="preserve"> </w:t>
+      </w:r>
+      <w:r>
+        <w:rPr>
+          <w:lang w:val="es-ES"/>
+        </w:rPr>
+        <w:t xml:space="preserve">(</w:t>
+      </w:r>
+      <w:r>
+        <w:rPr>
+          <w:rStyle w:val="VerbatimChar"/>
+          <w:lang w:val="es-ES"/>
+        </w:rPr>
+        <w:t xml:space="preserve">e2e/pwa.mjs</w:t>
+      </w:r>
+      <w:r>
+        <w:rPr>
+          <w:lang w:val="es-ES"/>
+        </w:rPr>
+        <w:t xml:space="preserve">): manifest e iconos válidos;</w:t>
+      </w:r>
+      <w:r>
+        <w:rPr>
+          <w:lang w:val="es-ES"/>
+        </w:rPr>
+        <w:t xml:space="preserve"> </w:t>
+      </w:r>
+      <w:r>
+        <w:rPr>
+          <w:b/>
+          <w:bCs/>
+          <w:lang w:val="es-ES"/>
+        </w:rPr>
         <w:t xml:space="preserve">Chrome no detecta errores de instalabilidad</w:t>
       </w:r>
       <w:r>
@@ -12320,7 +13132,7 @@
           <w:bCs/>
           <w:lang w:val="es-ES"/>
         </w:rPr>
-        <w:t xml:space="preserve">Electron, 16 pasos</w:t>
+        <w:t xml:space="preserve">Electron, 17 pasos</w:t>
       </w:r>
       <w:r>
         <w:rPr>
@@ -12345,7 +13157,7 @@
         <w:rPr>
           <w:lang w:val="es-ES"/>
         </w:rPr>
-        <w:t xml:space="preserve">; se ejecutan tanto con</w:t>
+        <w:t xml:space="preserve">, que incluye el panel y el tour en escritorio; se ejecutan tanto con</w:t>
       </w:r>
       <w:r>
         <w:rPr>
@@ -14012,7 +14824,7 @@
               <w:rPr>
                 <w:lang w:val="es-ES"/>
               </w:rPr>
-              <w:t xml:space="preserve">149 comprobaciones</w:t>
+              <w:t xml:space="preserve">187 comprobaciones</w:t>
             </w:r>
           </w:p>
         </w:tc>
@@ -15105,7 +15917,7 @@
           <w:rStyle w:val="VerbatimChar"/>
           <w:lang w:val="es-ES"/>
         </w:rPr>
-        <w:t xml:space="preserve">├── tests/                35 pruebas unitarias</w:t>
+        <w:t xml:space="preserve">├── tests/                49 pruebas unitarias</w:t>
       </w:r>
       <w:r>
         <w:br/>
@@ -15115,7 +15927,7 @@
           <w:rStyle w:val="VerbatimChar"/>
           <w:lang w:val="es-ES"/>
         </w:rPr>
-        <w:t xml:space="preserve">├── e2e/                  114 comprobaciones en navegador (web, auditoría QA, PWA, Electron)</w:t>
+        <w:t xml:space="preserve">├── e2e/                  138 comprobaciones en navegador (web, auditoría QA, onboarding, PWA, Electron)</w:t>
       </w:r>
       <w:r>
         <w:br/>
@@ -15399,7 +16211,7 @@
               <w:rPr>
                 <w:lang w:val="es-ES"/>
               </w:rPr>
-              <w:t xml:space="preserve">35 pruebas unitarias</w:t>
+              <w:t xml:space="preserve">49 pruebas unitarias</w:t>
             </w:r>
           </w:p>
         </w:tc>

</xml_diff>